<commit_message>
Week 1 worklog from Anas's completed Lab 1 notebook
- Lab 1/Lab1_completed.ipynb: Anas's notebook with the hard-coded Gemini key
  removed (genai.Client() now reads GEMINI_API_KEY from the environment)
- week1.py rewritten from that notebook's real outputs (student-mat.csv
  counting task, apple prompts, latencies), with a corrected comparison
  table and checkpoint answers; Figure 1.1 = latency chart from its numbers
- screenshot list, guide Week 1 page and CLAUDE.md updated to match

Co-Authored-By: Claude Opus 5.5 <noreply@anthropic.com>
Claude-Session: https://claude.ai/code/session_0189EmTvdNp75fbiYJaiwSjL
</commit_message>
<xml_diff>
--- a/Lab 1/Lab1_Worklog_Week1.docx
+++ b/Lab 1/Lab1_Worklog_Week1.docx
@@ -238,7 +238,7 @@
           <w:i/>
           <w:sz w:val="19"/>
         </w:rPr>
-        <w:t xml:space="preserve">My checklist for this week – ticked = done, unticked = still to do. Everything is in </w:t>
+        <w:t xml:space="preserve">My checklist for this week – ticked = done, unticked = still to do. My notebook is </w:t>
       </w:r>
       <w:r>
         <w:rPr>
@@ -247,7 +247,7 @@
           <w:i/>
           <w:sz w:val="18"/>
         </w:rPr>
-        <w:t>Lab 1/Lab1_LLM_Access.ipynb</w:t>
+        <w:t>Lab 1/Lab1_completed.ipynb</w:t>
       </w:r>
       <w:r>
         <w:rPr>
@@ -256,7 +256,7 @@
           <w:i/>
           <w:sz w:val="19"/>
         </w:rPr>
-        <w:t xml:space="preserve"> in my repo. (Yellow bits fill in by themselves once I've run the notebook and rebuilt this worklog.)</w:t>
+        <w:t xml:space="preserve"> in my repo.</w:t>
       </w:r>
     </w:p>
     <w:tbl>
@@ -381,7 +381,7 @@
                 <w:i w:val="0"/>
                 <w:sz w:val="18"/>
               </w:rPr>
-              <w:t>Read the Week 1 sheet + wrote the basics (LLM, API, Jupyter, local vs cloud) in my own words</w:t>
+              <w:t>Read the Week 1 sheet (LLM, API, Jupyter, local vs cloud)</w:t>
             </w:r>
           </w:p>
         </w:tc>
@@ -456,7 +456,7 @@
                 <w:i w:val="0"/>
                 <w:sz w:val="18"/>
               </w:rPr>
-              <w:t xml:space="preserve">Notebook </w:t>
+              <w:t xml:space="preserve">Installed Ollama + downloaded </w:t>
             </w:r>
             <w:r>
               <w:rPr>
@@ -465,7 +465,7 @@
                 <w:i w:val="0"/>
                 <w:sz w:val="17"/>
               </w:rPr>
-              <w:t>Lab1_LLM_Access.ipynb</w:t>
+              <w:t>llama3.2:1b</w:t>
             </w:r>
             <w:r>
               <w:rPr>
@@ -474,7 +474,604 @@
                 <w:i w:val="0"/>
                 <w:sz w:val="18"/>
               </w:rPr>
-              <w:t xml:space="preserve"> set up for all 9 steps</w:t>
+              <w:t xml:space="preserve"> (step 2)</w:t>
+            </w:r>
+          </w:p>
+        </w:tc>
+        <w:tc>
+          <w:tcPr>
+            <w:tcW w:type="dxa" w:w="3009"/>
+          </w:tcPr>
+          <w:p>
+            <w:pPr>
+              <w:spacing w:before="40" w:after="40"/>
+              <w:jc w:val="center"/>
+            </w:pPr>
+            <w:r>
+              <w:rPr>
+                <w:rFonts w:ascii="Arial" w:hAnsi="Arial" w:cs="Arial" w:eastAsia="Arial"/>
+                <w:b/>
+                <w:i w:val="0"/>
+                <w:color w:val="37863C"/>
+                <w:sz w:val="18"/>
+              </w:rPr>
+              <w:t>Done</w:t>
+            </w:r>
+          </w:p>
+        </w:tc>
+      </w:tr>
+      <w:tr>
+        <w:tc>
+          <w:tcPr>
+            <w:tcW w:type="dxa" w:w="3009"/>
+          </w:tcPr>
+          <w:p>
+            <w:pPr>
+              <w:spacing w:before="20" w:after="20"/>
+              <w:jc w:val="center"/>
+            </w:pPr>
+            <w:sdt>
+              <w:sdtPr>
+                <w:rPr>
+                  <w:rFonts w:ascii="MS Gothic" w:eastAsia="MS Gothic" w:hAnsi="MS Gothic"/>
+                  <w:sz w:val="22"/>
+                </w:rPr>
+                <w14:checkbox>
+                  <w14:checked w14:val="1"/>
+                  <w14:checkedState w14:val="2612" w14:font="MS Gothic"/>
+                  <w14:uncheckedState w14:val="2610" w14:font="MS Gothic"/>
+                </w14:checkbox>
+              </w:sdtPr>
+              <w:sdtContent>
+                <w:r>
+                  <w:rPr>
+                    <w:rFonts w:ascii="MS Gothic" w:eastAsia="MS Gothic" w:hAnsi="MS Gothic"/>
+                    <w:sz w:val="22"/>
+                  </w:rPr>
+                  <w:t>☒</w:t>
+                </w:r>
+              </w:sdtContent>
+            </w:sdt>
+          </w:p>
+        </w:tc>
+        <w:tc>
+          <w:tcPr>
+            <w:tcW w:type="dxa" w:w="3009"/>
+          </w:tcPr>
+          <w:p>
+            <w:pPr>
+              <w:spacing w:before="40" w:after="40"/>
+            </w:pPr>
+            <w:r>
+              <w:rPr>
+                <w:rFonts w:ascii="Arial" w:hAnsi="Arial" w:cs="Arial" w:eastAsia="Arial"/>
+                <w:b w:val="0"/>
+                <w:i w:val="0"/>
+                <w:sz w:val="18"/>
+              </w:rPr>
+              <w:t xml:space="preserve">Called the local model from Python with </w:t>
+            </w:r>
+            <w:r>
+              <w:rPr>
+                <w:rFonts w:ascii="Consolas" w:hAnsi="Consolas" w:cs="Consolas" w:eastAsia="Consolas"/>
+                <w:b w:val="0"/>
+                <w:i w:val="0"/>
+                <w:sz w:val="17"/>
+              </w:rPr>
+              <w:t>ollama.chat</w:t>
+            </w:r>
+            <w:r>
+              <w:rPr>
+                <w:rFonts w:ascii="Arial" w:hAnsi="Arial" w:cs="Arial" w:eastAsia="Arial"/>
+                <w:b w:val="0"/>
+                <w:i w:val="0"/>
+                <w:sz w:val="18"/>
+              </w:rPr>
+              <w:t xml:space="preserve"> (steps 3–4)</w:t>
+            </w:r>
+          </w:p>
+        </w:tc>
+        <w:tc>
+          <w:tcPr>
+            <w:tcW w:type="dxa" w:w="3009"/>
+          </w:tcPr>
+          <w:p>
+            <w:pPr>
+              <w:spacing w:before="40" w:after="40"/>
+              <w:jc w:val="center"/>
+            </w:pPr>
+            <w:r>
+              <w:rPr>
+                <w:rFonts w:ascii="Arial" w:hAnsi="Arial" w:cs="Arial" w:eastAsia="Arial"/>
+                <w:b/>
+                <w:i w:val="0"/>
+                <w:color w:val="37863C"/>
+                <w:sz w:val="18"/>
+              </w:rPr>
+              <w:t>Done</w:t>
+            </w:r>
+          </w:p>
+        </w:tc>
+      </w:tr>
+      <w:tr>
+        <w:tc>
+          <w:tcPr>
+            <w:tcW w:type="dxa" w:w="3009"/>
+          </w:tcPr>
+          <w:p>
+            <w:pPr>
+              <w:spacing w:before="20" w:after="20"/>
+              <w:jc w:val="center"/>
+            </w:pPr>
+            <w:sdt>
+              <w:sdtPr>
+                <w:rPr>
+                  <w:rFonts w:ascii="MS Gothic" w:eastAsia="MS Gothic" w:hAnsi="MS Gothic"/>
+                  <w:sz w:val="22"/>
+                </w:rPr>
+                <w14:checkbox>
+                  <w14:checked w14:val="1"/>
+                  <w14:checkedState w14:val="2612" w14:font="MS Gothic"/>
+                  <w14:uncheckedState w14:val="2610" w14:font="MS Gothic"/>
+                </w14:checkbox>
+              </w:sdtPr>
+              <w:sdtContent>
+                <w:r>
+                  <w:rPr>
+                    <w:rFonts w:ascii="MS Gothic" w:eastAsia="MS Gothic" w:hAnsi="MS Gothic"/>
+                    <w:sz w:val="22"/>
+                  </w:rPr>
+                  <w:t>☒</w:t>
+                </w:r>
+              </w:sdtContent>
+            </w:sdt>
+          </w:p>
+        </w:tc>
+        <w:tc>
+          <w:tcPr>
+            <w:tcW w:type="dxa" w:w="3009"/>
+          </w:tcPr>
+          <w:p>
+            <w:pPr>
+              <w:spacing w:before="40" w:after="40"/>
+            </w:pPr>
+            <w:r>
+              <w:rPr>
+                <w:rFonts w:ascii="Arial" w:hAnsi="Arial" w:cs="Arial" w:eastAsia="Arial"/>
+                <w:b w:val="0"/>
+                <w:i w:val="0"/>
+                <w:sz w:val="18"/>
+              </w:rPr>
+              <w:t xml:space="preserve">Gemini API key + the same question in the cloud with </w:t>
+            </w:r>
+            <w:r>
+              <w:rPr>
+                <w:rFonts w:ascii="Consolas" w:hAnsi="Consolas" w:cs="Consolas" w:eastAsia="Consolas"/>
+                <w:b w:val="0"/>
+                <w:i w:val="0"/>
+                <w:sz w:val="17"/>
+              </w:rPr>
+              <w:t>google-genai</w:t>
+            </w:r>
+            <w:r>
+              <w:rPr>
+                <w:rFonts w:ascii="Arial" w:hAnsi="Arial" w:cs="Arial" w:eastAsia="Arial"/>
+                <w:b w:val="0"/>
+                <w:i w:val="0"/>
+                <w:sz w:val="18"/>
+              </w:rPr>
+              <w:t xml:space="preserve"> (step 5)</w:t>
+            </w:r>
+          </w:p>
+        </w:tc>
+        <w:tc>
+          <w:tcPr>
+            <w:tcW w:type="dxa" w:w="3009"/>
+          </w:tcPr>
+          <w:p>
+            <w:pPr>
+              <w:spacing w:before="40" w:after="40"/>
+              <w:jc w:val="center"/>
+            </w:pPr>
+            <w:r>
+              <w:rPr>
+                <w:rFonts w:ascii="Arial" w:hAnsi="Arial" w:cs="Arial" w:eastAsia="Arial"/>
+                <w:b/>
+                <w:i w:val="0"/>
+                <w:color w:val="37863C"/>
+                <w:sz w:val="18"/>
+              </w:rPr>
+              <w:t>Done</w:t>
+            </w:r>
+          </w:p>
+        </w:tc>
+      </w:tr>
+      <w:tr>
+        <w:tc>
+          <w:tcPr>
+            <w:tcW w:type="dxa" w:w="3009"/>
+          </w:tcPr>
+          <w:p>
+            <w:pPr>
+              <w:spacing w:before="20" w:after="20"/>
+              <w:jc w:val="center"/>
+            </w:pPr>
+            <w:sdt>
+              <w:sdtPr>
+                <w:rPr>
+                  <w:rFonts w:ascii="MS Gothic" w:eastAsia="MS Gothic" w:hAnsi="MS Gothic"/>
+                  <w:sz w:val="22"/>
+                </w:rPr>
+                <w14:checkbox>
+                  <w14:checked w14:val="1"/>
+                  <w14:checkedState w14:val="2612" w14:font="MS Gothic"/>
+                  <w14:uncheckedState w14:val="2610" w14:font="MS Gothic"/>
+                </w14:checkbox>
+              </w:sdtPr>
+              <w:sdtContent>
+                <w:r>
+                  <w:rPr>
+                    <w:rFonts w:ascii="MS Gothic" w:eastAsia="MS Gothic" w:hAnsi="MS Gothic"/>
+                    <w:sz w:val="22"/>
+                  </w:rPr>
+                  <w:t>☒</w:t>
+                </w:r>
+              </w:sdtContent>
+            </w:sdt>
+          </w:p>
+        </w:tc>
+        <w:tc>
+          <w:tcPr>
+            <w:tcW w:type="dxa" w:w="3009"/>
+          </w:tcPr>
+          <w:p>
+            <w:pPr>
+              <w:spacing w:before="40" w:after="40"/>
+            </w:pPr>
+            <w:r>
+              <w:rPr>
+                <w:rFonts w:ascii="Arial" w:hAnsi="Arial" w:cs="Arial" w:eastAsia="Arial"/>
+                <w:b w:val="0"/>
+                <w:i w:val="0"/>
+                <w:sz w:val="18"/>
+              </w:rPr>
+              <w:t>Small dataset (</w:t>
+            </w:r>
+            <w:r>
+              <w:rPr>
+                <w:rFonts w:ascii="Consolas" w:hAnsi="Consolas" w:cs="Consolas" w:eastAsia="Consolas"/>
+                <w:b w:val="0"/>
+                <w:i w:val="0"/>
+                <w:sz w:val="17"/>
+              </w:rPr>
+              <w:t>student-mat.csv</w:t>
+            </w:r>
+            <w:r>
+              <w:rPr>
+                <w:rFonts w:ascii="Arial" w:hAnsi="Arial" w:cs="Arial" w:eastAsia="Arial"/>
+                <w:b w:val="0"/>
+                <w:i w:val="0"/>
+                <w:sz w:val="18"/>
+              </w:rPr>
+              <w:t xml:space="preserve">, 20 rows) + the same prompt on both models, timed with </w:t>
+            </w:r>
+            <w:r>
+              <w:rPr>
+                <w:rFonts w:ascii="Consolas" w:hAnsi="Consolas" w:cs="Consolas" w:eastAsia="Consolas"/>
+                <w:b w:val="0"/>
+                <w:i w:val="0"/>
+                <w:sz w:val="17"/>
+              </w:rPr>
+              <w:t>time.time()</w:t>
+            </w:r>
+            <w:r>
+              <w:rPr>
+                <w:rFonts w:ascii="Arial" w:hAnsi="Arial" w:cs="Arial" w:eastAsia="Arial"/>
+                <w:b w:val="0"/>
+                <w:i w:val="0"/>
+                <w:sz w:val="18"/>
+              </w:rPr>
+              <w:t xml:space="preserve"> (steps 6–7)</w:t>
+            </w:r>
+          </w:p>
+        </w:tc>
+        <w:tc>
+          <w:tcPr>
+            <w:tcW w:type="dxa" w:w="3009"/>
+          </w:tcPr>
+          <w:p>
+            <w:pPr>
+              <w:spacing w:before="40" w:after="40"/>
+              <w:jc w:val="center"/>
+            </w:pPr>
+            <w:r>
+              <w:rPr>
+                <w:rFonts w:ascii="Arial" w:hAnsi="Arial" w:cs="Arial" w:eastAsia="Arial"/>
+                <w:b/>
+                <w:i w:val="0"/>
+                <w:color w:val="37863C"/>
+                <w:sz w:val="18"/>
+              </w:rPr>
+              <w:t>Done</w:t>
+            </w:r>
+          </w:p>
+        </w:tc>
+      </w:tr>
+      <w:tr>
+        <w:tc>
+          <w:tcPr>
+            <w:tcW w:type="dxa" w:w="3009"/>
+          </w:tcPr>
+          <w:p>
+            <w:pPr>
+              <w:spacing w:before="20" w:after="20"/>
+              <w:jc w:val="center"/>
+            </w:pPr>
+            <w:sdt>
+              <w:sdtPr>
+                <w:rPr>
+                  <w:rFonts w:ascii="MS Gothic" w:eastAsia="MS Gothic" w:hAnsi="MS Gothic"/>
+                  <w:sz w:val="22"/>
+                </w:rPr>
+                <w14:checkbox>
+                  <w14:checked w14:val="1"/>
+                  <w14:checkedState w14:val="2612" w14:font="MS Gothic"/>
+                  <w14:uncheckedState w14:val="2610" w14:font="MS Gothic"/>
+                </w14:checkbox>
+              </w:sdtPr>
+              <w:sdtContent>
+                <w:r>
+                  <w:rPr>
+                    <w:rFonts w:ascii="MS Gothic" w:eastAsia="MS Gothic" w:hAnsi="MS Gothic"/>
+                    <w:sz w:val="22"/>
+                  </w:rPr>
+                  <w:t>☒</w:t>
+                </w:r>
+              </w:sdtContent>
+            </w:sdt>
+          </w:p>
+        </w:tc>
+        <w:tc>
+          <w:tcPr>
+            <w:tcW w:type="dxa" w:w="3009"/>
+          </w:tcPr>
+          <w:p>
+            <w:pPr>
+              <w:spacing w:before="40" w:after="40"/>
+            </w:pPr>
+            <w:r>
+              <w:rPr>
+                <w:rFonts w:ascii="Arial" w:hAnsi="Arial" w:cs="Arial" w:eastAsia="Arial"/>
+                <w:b w:val="0"/>
+                <w:i w:val="0"/>
+                <w:sz w:val="18"/>
+              </w:rPr>
+              <w:t>'Think step by step' vs direct prompt on both models (step 8)</w:t>
+            </w:r>
+          </w:p>
+        </w:tc>
+        <w:tc>
+          <w:tcPr>
+            <w:tcW w:type="dxa" w:w="3009"/>
+          </w:tcPr>
+          <w:p>
+            <w:pPr>
+              <w:spacing w:before="40" w:after="40"/>
+              <w:jc w:val="center"/>
+            </w:pPr>
+            <w:r>
+              <w:rPr>
+                <w:rFonts w:ascii="Arial" w:hAnsi="Arial" w:cs="Arial" w:eastAsia="Arial"/>
+                <w:b/>
+                <w:i w:val="0"/>
+                <w:color w:val="37863C"/>
+                <w:sz w:val="18"/>
+              </w:rPr>
+              <w:t>Done</w:t>
+            </w:r>
+          </w:p>
+        </w:tc>
+      </w:tr>
+      <w:tr>
+        <w:tc>
+          <w:tcPr>
+            <w:tcW w:type="dxa" w:w="3009"/>
+          </w:tcPr>
+          <w:p>
+            <w:pPr>
+              <w:spacing w:before="20" w:after="20"/>
+              <w:jc w:val="center"/>
+            </w:pPr>
+            <w:sdt>
+              <w:sdtPr>
+                <w:rPr>
+                  <w:rFonts w:ascii="MS Gothic" w:eastAsia="MS Gothic" w:hAnsi="MS Gothic"/>
+                  <w:sz w:val="22"/>
+                </w:rPr>
+                <w14:checkbox>
+                  <w14:checked w14:val="1"/>
+                  <w14:checkedState w14:val="2612" w14:font="MS Gothic"/>
+                  <w14:uncheckedState w14:val="2610" w14:font="MS Gothic"/>
+                </w14:checkbox>
+              </w:sdtPr>
+              <w:sdtContent>
+                <w:r>
+                  <w:rPr>
+                    <w:rFonts w:ascii="MS Gothic" w:eastAsia="MS Gothic" w:hAnsi="MS Gothic"/>
+                    <w:sz w:val="22"/>
+                  </w:rPr>
+                  <w:t>☒</w:t>
+                </w:r>
+              </w:sdtContent>
+            </w:sdt>
+          </w:p>
+        </w:tc>
+        <w:tc>
+          <w:tcPr>
+            <w:tcW w:type="dxa" w:w="3009"/>
+          </w:tcPr>
+          <w:p>
+            <w:pPr>
+              <w:spacing w:before="40" w:after="40"/>
+            </w:pPr>
+            <w:r>
+              <w:rPr>
+                <w:rFonts w:ascii="Arial" w:hAnsi="Arial" w:cs="Arial" w:eastAsia="Arial"/>
+                <w:b w:val="0"/>
+                <w:i w:val="0"/>
+                <w:sz w:val="18"/>
+              </w:rPr>
+              <w:t>Gradio chat demo (step 9)</w:t>
+            </w:r>
+          </w:p>
+        </w:tc>
+        <w:tc>
+          <w:tcPr>
+            <w:tcW w:type="dxa" w:w="3009"/>
+          </w:tcPr>
+          <w:p>
+            <w:pPr>
+              <w:spacing w:before="40" w:after="40"/>
+              <w:jc w:val="center"/>
+            </w:pPr>
+            <w:r>
+              <w:rPr>
+                <w:rFonts w:ascii="Arial" w:hAnsi="Arial" w:cs="Arial" w:eastAsia="Arial"/>
+                <w:b/>
+                <w:i w:val="0"/>
+                <w:color w:val="37863C"/>
+                <w:sz w:val="18"/>
+              </w:rPr>
+              <w:t>Done</w:t>
+            </w:r>
+          </w:p>
+        </w:tc>
+      </w:tr>
+      <w:tr>
+        <w:tc>
+          <w:tcPr>
+            <w:tcW w:type="dxa" w:w="3009"/>
+          </w:tcPr>
+          <w:p>
+            <w:pPr>
+              <w:spacing w:before="20" w:after="20"/>
+              <w:jc w:val="center"/>
+            </w:pPr>
+            <w:sdt>
+              <w:sdtPr>
+                <w:rPr>
+                  <w:rFonts w:ascii="MS Gothic" w:eastAsia="MS Gothic" w:hAnsi="MS Gothic"/>
+                  <w:sz w:val="22"/>
+                </w:rPr>
+                <w14:checkbox>
+                  <w14:checked w14:val="1"/>
+                  <w14:checkedState w14:val="2612" w14:font="MS Gothic"/>
+                  <w14:uncheckedState w14:val="2610" w14:font="MS Gothic"/>
+                </w14:checkbox>
+              </w:sdtPr>
+              <w:sdtContent>
+                <w:r>
+                  <w:rPr>
+                    <w:rFonts w:ascii="MS Gothic" w:eastAsia="MS Gothic" w:hAnsi="MS Gothic"/>
+                    <w:sz w:val="22"/>
+                  </w:rPr>
+                  <w:t>☒</w:t>
+                </w:r>
+              </w:sdtContent>
+            </w:sdt>
+          </w:p>
+        </w:tc>
+        <w:tc>
+          <w:tcPr>
+            <w:tcW w:type="dxa" w:w="3009"/>
+          </w:tcPr>
+          <w:p>
+            <w:pPr>
+              <w:spacing w:before="40" w:after="40"/>
+            </w:pPr>
+            <w:r>
+              <w:rPr>
+                <w:rFonts w:ascii="Arial" w:hAnsi="Arial" w:cs="Arial" w:eastAsia="Arial"/>
+                <w:b w:val="0"/>
+                <w:i w:val="0"/>
+                <w:sz w:val="18"/>
+              </w:rPr>
+              <w:t>Deliverable: comparison table (latency, cost, quality) + checkpoint answers</w:t>
+            </w:r>
+          </w:p>
+        </w:tc>
+        <w:tc>
+          <w:tcPr>
+            <w:tcW w:type="dxa" w:w="3009"/>
+          </w:tcPr>
+          <w:p>
+            <w:pPr>
+              <w:spacing w:before="40" w:after="40"/>
+              <w:jc w:val="center"/>
+            </w:pPr>
+            <w:r>
+              <w:rPr>
+                <w:rFonts w:ascii="Arial" w:hAnsi="Arial" w:cs="Arial" w:eastAsia="Arial"/>
+                <w:b/>
+                <w:i w:val="0"/>
+                <w:color w:val="37863C"/>
+                <w:sz w:val="18"/>
+              </w:rPr>
+              <w:t>Done</w:t>
+            </w:r>
+          </w:p>
+        </w:tc>
+      </w:tr>
+      <w:tr>
+        <w:tc>
+          <w:tcPr>
+            <w:tcW w:type="dxa" w:w="3009"/>
+          </w:tcPr>
+          <w:p>
+            <w:pPr>
+              <w:spacing w:before="20" w:after="20"/>
+              <w:jc w:val="center"/>
+            </w:pPr>
+            <w:sdt>
+              <w:sdtPr>
+                <w:rPr>
+                  <w:rFonts w:ascii="MS Gothic" w:eastAsia="MS Gothic" w:hAnsi="MS Gothic"/>
+                  <w:sz w:val="22"/>
+                </w:rPr>
+                <w14:checkbox>
+                  <w14:checked w14:val="1"/>
+                  <w14:checkedState w14:val="2612" w14:font="MS Gothic"/>
+                  <w14:uncheckedState w14:val="2610" w14:font="MS Gothic"/>
+                </w14:checkbox>
+              </w:sdtPr>
+              <w:sdtContent>
+                <w:r>
+                  <w:rPr>
+                    <w:rFonts w:ascii="MS Gothic" w:eastAsia="MS Gothic" w:hAnsi="MS Gothic"/>
+                    <w:sz w:val="22"/>
+                  </w:rPr>
+                  <w:t>☒</w:t>
+                </w:r>
+              </w:sdtContent>
+            </w:sdt>
+          </w:p>
+        </w:tc>
+        <w:tc>
+          <w:tcPr>
+            <w:tcW w:type="dxa" w:w="3009"/>
+          </w:tcPr>
+          <w:p>
+            <w:pPr>
+              <w:spacing w:before="40" w:after="40"/>
+            </w:pPr>
+            <w:r>
+              <w:rPr>
+                <w:rFonts w:ascii="Arial" w:hAnsi="Arial" w:cs="Arial" w:eastAsia="Arial"/>
+                <w:b w:val="0"/>
+                <w:i w:val="0"/>
+                <w:sz w:val="18"/>
+              </w:rPr>
+              <w:t>Took the API key out of the notebook I hand in</w:t>
             </w:r>
           </w:p>
         </w:tc>
@@ -549,603 +1146,6 @@
                 <w:i w:val="0"/>
                 <w:sz w:val="18"/>
               </w:rPr>
-              <w:t xml:space="preserve">Installed Ollama + ran </w:t>
-            </w:r>
-            <w:r>
-              <w:rPr>
-                <w:rFonts w:ascii="Consolas" w:hAnsi="Consolas" w:cs="Consolas" w:eastAsia="Consolas"/>
-                <w:b w:val="0"/>
-                <w:i w:val="0"/>
-                <w:sz w:val="17"/>
-              </w:rPr>
-              <w:t>llama3.2:1b</w:t>
-            </w:r>
-            <w:r>
-              <w:rPr>
-                <w:rFonts w:ascii="Arial" w:hAnsi="Arial" w:cs="Arial" w:eastAsia="Arial"/>
-                <w:b w:val="0"/>
-                <w:i w:val="0"/>
-                <w:sz w:val="18"/>
-              </w:rPr>
-              <w:t xml:space="preserve"> in the terminal (step 2)</w:t>
-            </w:r>
-          </w:p>
-        </w:tc>
-        <w:tc>
-          <w:tcPr>
-            <w:tcW w:type="dxa" w:w="3009"/>
-          </w:tcPr>
-          <w:p>
-            <w:pPr>
-              <w:spacing w:before="40" w:after="40"/>
-              <w:jc w:val="center"/>
-            </w:pPr>
-            <w:r>
-              <w:rPr>
-                <w:rFonts w:ascii="Arial" w:hAnsi="Arial" w:cs="Arial" w:eastAsia="Arial"/>
-                <w:b/>
-                <w:i w:val="0"/>
-                <w:color w:val="C05000"/>
-                <w:sz w:val="18"/>
-              </w:rPr>
-              <w:t>To do</w:t>
-            </w:r>
-          </w:p>
-        </w:tc>
-      </w:tr>
-      <w:tr>
-        <w:tc>
-          <w:tcPr>
-            <w:tcW w:type="dxa" w:w="3009"/>
-          </w:tcPr>
-          <w:p>
-            <w:pPr>
-              <w:spacing w:before="20" w:after="20"/>
-              <w:jc w:val="center"/>
-            </w:pPr>
-            <w:sdt>
-              <w:sdtPr>
-                <w:rPr>
-                  <w:rFonts w:ascii="MS Gothic" w:eastAsia="MS Gothic" w:hAnsi="MS Gothic"/>
-                  <w:sz w:val="22"/>
-                </w:rPr>
-                <w14:checkbox>
-                  <w14:checked w14:val="0"/>
-                  <w14:checkedState w14:val="2612" w14:font="MS Gothic"/>
-                  <w14:uncheckedState w14:val="2610" w14:font="MS Gothic"/>
-                </w14:checkbox>
-              </w:sdtPr>
-              <w:sdtContent>
-                <w:r>
-                  <w:rPr>
-                    <w:rFonts w:ascii="MS Gothic" w:eastAsia="MS Gothic" w:hAnsi="MS Gothic"/>
-                    <w:sz w:val="22"/>
-                  </w:rPr>
-                  <w:t>☐</w:t>
-                </w:r>
-              </w:sdtContent>
-            </w:sdt>
-          </w:p>
-        </w:tc>
-        <w:tc>
-          <w:tcPr>
-            <w:tcW w:type="dxa" w:w="3009"/>
-          </w:tcPr>
-          <w:p>
-            <w:pPr>
-              <w:spacing w:before="40" w:after="40"/>
-            </w:pPr>
-            <w:r>
-              <w:rPr>
-                <w:rFonts w:ascii="Arial" w:hAnsi="Arial" w:cs="Arial" w:eastAsia="Arial"/>
-                <w:b w:val="0"/>
-                <w:i w:val="0"/>
-                <w:sz w:val="18"/>
-              </w:rPr>
-              <w:t>Called the local model from Python + looked at what happens under the hood (steps 3–4)</w:t>
-            </w:r>
-          </w:p>
-        </w:tc>
-        <w:tc>
-          <w:tcPr>
-            <w:tcW w:type="dxa" w:w="3009"/>
-          </w:tcPr>
-          <w:p>
-            <w:pPr>
-              <w:spacing w:before="40" w:after="40"/>
-              <w:jc w:val="center"/>
-            </w:pPr>
-            <w:r>
-              <w:rPr>
-                <w:rFonts w:ascii="Arial" w:hAnsi="Arial" w:cs="Arial" w:eastAsia="Arial"/>
-                <w:b/>
-                <w:i w:val="0"/>
-                <w:color w:val="C05000"/>
-                <w:sz w:val="18"/>
-              </w:rPr>
-              <w:t>To do</w:t>
-            </w:r>
-          </w:p>
-        </w:tc>
-      </w:tr>
-      <w:tr>
-        <w:tc>
-          <w:tcPr>
-            <w:tcW w:type="dxa" w:w="3009"/>
-          </w:tcPr>
-          <w:p>
-            <w:pPr>
-              <w:spacing w:before="20" w:after="20"/>
-              <w:jc w:val="center"/>
-            </w:pPr>
-            <w:sdt>
-              <w:sdtPr>
-                <w:rPr>
-                  <w:rFonts w:ascii="MS Gothic" w:eastAsia="MS Gothic" w:hAnsi="MS Gothic"/>
-                  <w:sz w:val="22"/>
-                </w:rPr>
-                <w14:checkbox>
-                  <w14:checked w14:val="0"/>
-                  <w14:checkedState w14:val="2612" w14:font="MS Gothic"/>
-                  <w14:uncheckedState w14:val="2610" w14:font="MS Gothic"/>
-                </w14:checkbox>
-              </w:sdtPr>
-              <w:sdtContent>
-                <w:r>
-                  <w:rPr>
-                    <w:rFonts w:ascii="MS Gothic" w:eastAsia="MS Gothic" w:hAnsi="MS Gothic"/>
-                    <w:sz w:val="22"/>
-                  </w:rPr>
-                  <w:t>☐</w:t>
-                </w:r>
-              </w:sdtContent>
-            </w:sdt>
-          </w:p>
-        </w:tc>
-        <w:tc>
-          <w:tcPr>
-            <w:tcW w:type="dxa" w:w="3009"/>
-          </w:tcPr>
-          <w:p>
-            <w:pPr>
-              <w:spacing w:before="40" w:after="40"/>
-            </w:pPr>
-            <w:r>
-              <w:rPr>
-                <w:rFonts w:ascii="Arial" w:hAnsi="Arial" w:cs="Arial" w:eastAsia="Arial"/>
-                <w:b w:val="0"/>
-                <w:i w:val="0"/>
-                <w:sz w:val="18"/>
-              </w:rPr>
-              <w:t xml:space="preserve">Gemini API key (kept in </w:t>
-            </w:r>
-            <w:r>
-              <w:rPr>
-                <w:rFonts w:ascii="Consolas" w:hAnsi="Consolas" w:cs="Consolas" w:eastAsia="Consolas"/>
-                <w:b w:val="0"/>
-                <w:i w:val="0"/>
-                <w:sz w:val="17"/>
-              </w:rPr>
-              <w:t>.env</w:t>
-            </w:r>
-            <w:r>
-              <w:rPr>
-                <w:rFonts w:ascii="Arial" w:hAnsi="Arial" w:cs="Arial" w:eastAsia="Arial"/>
-                <w:b w:val="0"/>
-                <w:i w:val="0"/>
-                <w:sz w:val="18"/>
-              </w:rPr>
-              <w:t>) + the same prompt in the cloud (step 5)</w:t>
-            </w:r>
-          </w:p>
-        </w:tc>
-        <w:tc>
-          <w:tcPr>
-            <w:tcW w:type="dxa" w:w="3009"/>
-          </w:tcPr>
-          <w:p>
-            <w:pPr>
-              <w:spacing w:before="40" w:after="40"/>
-              <w:jc w:val="center"/>
-            </w:pPr>
-            <w:r>
-              <w:rPr>
-                <w:rFonts w:ascii="Arial" w:hAnsi="Arial" w:cs="Arial" w:eastAsia="Arial"/>
-                <w:b/>
-                <w:i w:val="0"/>
-                <w:color w:val="C05000"/>
-                <w:sz w:val="18"/>
-              </w:rPr>
-              <w:t>To do</w:t>
-            </w:r>
-          </w:p>
-        </w:tc>
-      </w:tr>
-      <w:tr>
-        <w:tc>
-          <w:tcPr>
-            <w:tcW w:type="dxa" w:w="3009"/>
-          </w:tcPr>
-          <w:p>
-            <w:pPr>
-              <w:spacing w:before="20" w:after="20"/>
-              <w:jc w:val="center"/>
-            </w:pPr>
-            <w:sdt>
-              <w:sdtPr>
-                <w:rPr>
-                  <w:rFonts w:ascii="MS Gothic" w:eastAsia="MS Gothic" w:hAnsi="MS Gothic"/>
-                  <w:sz w:val="22"/>
-                </w:rPr>
-                <w14:checkbox>
-                  <w14:checked w14:val="0"/>
-                  <w14:checkedState w14:val="2612" w14:font="MS Gothic"/>
-                  <w14:uncheckedState w14:val="2610" w14:font="MS Gothic"/>
-                </w14:checkbox>
-              </w:sdtPr>
-              <w:sdtContent>
-                <w:r>
-                  <w:rPr>
-                    <w:rFonts w:ascii="MS Gothic" w:eastAsia="MS Gothic" w:hAnsi="MS Gothic"/>
-                    <w:sz w:val="22"/>
-                  </w:rPr>
-                  <w:t>☐</w:t>
-                </w:r>
-              </w:sdtContent>
-            </w:sdt>
-          </w:p>
-        </w:tc>
-        <w:tc>
-          <w:tcPr>
-            <w:tcW w:type="dxa" w:w="3009"/>
-          </w:tcPr>
-          <w:p>
-            <w:pPr>
-              <w:spacing w:before="40" w:after="40"/>
-            </w:pPr>
-            <w:r>
-              <w:rPr>
-                <w:rFonts w:ascii="Arial" w:hAnsi="Arial" w:cs="Arial" w:eastAsia="Arial"/>
-                <w:b w:val="0"/>
-                <w:i w:val="0"/>
-                <w:sz w:val="18"/>
-              </w:rPr>
-              <w:t xml:space="preserve">Loaded </w:t>
-            </w:r>
-            <w:r>
-              <w:rPr>
-                <w:rFonts w:ascii="Consolas" w:hAnsi="Consolas" w:cs="Consolas" w:eastAsia="Consolas"/>
-                <w:b w:val="0"/>
-                <w:i w:val="0"/>
-                <w:sz w:val="17"/>
-              </w:rPr>
-              <w:t>reviews.csv</w:t>
-            </w:r>
-            <w:r>
-              <w:rPr>
-                <w:rFonts w:ascii="Arial" w:hAnsi="Arial" w:cs="Arial" w:eastAsia="Arial"/>
-                <w:b w:val="0"/>
-                <w:i w:val="0"/>
-                <w:sz w:val="18"/>
-              </w:rPr>
-              <w:t xml:space="preserve"> + ran the same prompts on both models with a </w:t>
-            </w:r>
-            <w:r>
-              <w:rPr>
-                <w:rFonts w:ascii="Consolas" w:hAnsi="Consolas" w:cs="Consolas" w:eastAsia="Consolas"/>
-                <w:b w:val="0"/>
-                <w:i w:val="0"/>
-                <w:sz w:val="17"/>
-              </w:rPr>
-              <w:t>time.time()</w:t>
-            </w:r>
-            <w:r>
-              <w:rPr>
-                <w:rFonts w:ascii="Arial" w:hAnsi="Arial" w:cs="Arial" w:eastAsia="Arial"/>
-                <w:b w:val="0"/>
-                <w:i w:val="0"/>
-                <w:sz w:val="18"/>
-              </w:rPr>
-              <w:t xml:space="preserve"> wrapper (steps 6–7)</w:t>
-            </w:r>
-          </w:p>
-        </w:tc>
-        <w:tc>
-          <w:tcPr>
-            <w:tcW w:type="dxa" w:w="3009"/>
-          </w:tcPr>
-          <w:p>
-            <w:pPr>
-              <w:spacing w:before="40" w:after="40"/>
-              <w:jc w:val="center"/>
-            </w:pPr>
-            <w:r>
-              <w:rPr>
-                <w:rFonts w:ascii="Arial" w:hAnsi="Arial" w:cs="Arial" w:eastAsia="Arial"/>
-                <w:b/>
-                <w:i w:val="0"/>
-                <w:color w:val="C05000"/>
-                <w:sz w:val="18"/>
-              </w:rPr>
-              <w:t>To do</w:t>
-            </w:r>
-          </w:p>
-        </w:tc>
-      </w:tr>
-      <w:tr>
-        <w:tc>
-          <w:tcPr>
-            <w:tcW w:type="dxa" w:w="3009"/>
-          </w:tcPr>
-          <w:p>
-            <w:pPr>
-              <w:spacing w:before="20" w:after="20"/>
-              <w:jc w:val="center"/>
-            </w:pPr>
-            <w:sdt>
-              <w:sdtPr>
-                <w:rPr>
-                  <w:rFonts w:ascii="MS Gothic" w:eastAsia="MS Gothic" w:hAnsi="MS Gothic"/>
-                  <w:sz w:val="22"/>
-                </w:rPr>
-                <w14:checkbox>
-                  <w14:checked w14:val="0"/>
-                  <w14:checkedState w14:val="2612" w14:font="MS Gothic"/>
-                  <w14:uncheckedState w14:val="2610" w14:font="MS Gothic"/>
-                </w14:checkbox>
-              </w:sdtPr>
-              <w:sdtContent>
-                <w:r>
-                  <w:rPr>
-                    <w:rFonts w:ascii="MS Gothic" w:eastAsia="MS Gothic" w:hAnsi="MS Gothic"/>
-                    <w:sz w:val="22"/>
-                  </w:rPr>
-                  <w:t>☐</w:t>
-                </w:r>
-              </w:sdtContent>
-            </w:sdt>
-          </w:p>
-        </w:tc>
-        <w:tc>
-          <w:tcPr>
-            <w:tcW w:type="dxa" w:w="3009"/>
-          </w:tcPr>
-          <w:p>
-            <w:pPr>
-              <w:spacing w:before="40" w:after="40"/>
-            </w:pPr>
-            <w:r>
-              <w:rPr>
-                <w:rFonts w:ascii="Arial" w:hAnsi="Arial" w:cs="Arial" w:eastAsia="Arial"/>
-                <w:b w:val="0"/>
-                <w:i w:val="0"/>
-                <w:sz w:val="18"/>
-              </w:rPr>
-              <w:t>'Think step by step' vs direct answer (step 8)</w:t>
-            </w:r>
-          </w:p>
-        </w:tc>
-        <w:tc>
-          <w:tcPr>
-            <w:tcW w:type="dxa" w:w="3009"/>
-          </w:tcPr>
-          <w:p>
-            <w:pPr>
-              <w:spacing w:before="40" w:after="40"/>
-              <w:jc w:val="center"/>
-            </w:pPr>
-            <w:r>
-              <w:rPr>
-                <w:rFonts w:ascii="Arial" w:hAnsi="Arial" w:cs="Arial" w:eastAsia="Arial"/>
-                <w:b/>
-                <w:i w:val="0"/>
-                <w:color w:val="C05000"/>
-                <w:sz w:val="18"/>
-              </w:rPr>
-              <w:t>To do</w:t>
-            </w:r>
-          </w:p>
-        </w:tc>
-      </w:tr>
-      <w:tr>
-        <w:tc>
-          <w:tcPr>
-            <w:tcW w:type="dxa" w:w="3009"/>
-          </w:tcPr>
-          <w:p>
-            <w:pPr>
-              <w:spacing w:before="20" w:after="20"/>
-              <w:jc w:val="center"/>
-            </w:pPr>
-            <w:sdt>
-              <w:sdtPr>
-                <w:rPr>
-                  <w:rFonts w:ascii="MS Gothic" w:eastAsia="MS Gothic" w:hAnsi="MS Gothic"/>
-                  <w:sz w:val="22"/>
-                </w:rPr>
-                <w14:checkbox>
-                  <w14:checked w14:val="0"/>
-                  <w14:checkedState w14:val="2612" w14:font="MS Gothic"/>
-                  <w14:uncheckedState w14:val="2610" w14:font="MS Gothic"/>
-                </w14:checkbox>
-              </w:sdtPr>
-              <w:sdtContent>
-                <w:r>
-                  <w:rPr>
-                    <w:rFonts w:ascii="MS Gothic" w:eastAsia="MS Gothic" w:hAnsi="MS Gothic"/>
-                    <w:sz w:val="22"/>
-                  </w:rPr>
-                  <w:t>☐</w:t>
-                </w:r>
-              </w:sdtContent>
-            </w:sdt>
-          </w:p>
-        </w:tc>
-        <w:tc>
-          <w:tcPr>
-            <w:tcW w:type="dxa" w:w="3009"/>
-          </w:tcPr>
-          <w:p>
-            <w:pPr>
-              <w:spacing w:before="40" w:after="40"/>
-            </w:pPr>
-            <w:r>
-              <w:rPr>
-                <w:rFonts w:ascii="Arial" w:hAnsi="Arial" w:cs="Arial" w:eastAsia="Arial"/>
-                <w:b w:val="0"/>
-                <w:i w:val="0"/>
-                <w:sz w:val="18"/>
-              </w:rPr>
-              <w:t>Gradio chat demo (step 9)</w:t>
-            </w:r>
-          </w:p>
-        </w:tc>
-        <w:tc>
-          <w:tcPr>
-            <w:tcW w:type="dxa" w:w="3009"/>
-          </w:tcPr>
-          <w:p>
-            <w:pPr>
-              <w:spacing w:before="40" w:after="40"/>
-              <w:jc w:val="center"/>
-            </w:pPr>
-            <w:r>
-              <w:rPr>
-                <w:rFonts w:ascii="Arial" w:hAnsi="Arial" w:cs="Arial" w:eastAsia="Arial"/>
-                <w:b/>
-                <w:i w:val="0"/>
-                <w:color w:val="C05000"/>
-                <w:sz w:val="18"/>
-              </w:rPr>
-              <w:t>To do</w:t>
-            </w:r>
-          </w:p>
-        </w:tc>
-      </w:tr>
-      <w:tr>
-        <w:tc>
-          <w:tcPr>
-            <w:tcW w:type="dxa" w:w="3009"/>
-          </w:tcPr>
-          <w:p>
-            <w:pPr>
-              <w:spacing w:before="20" w:after="20"/>
-              <w:jc w:val="center"/>
-            </w:pPr>
-            <w:sdt>
-              <w:sdtPr>
-                <w:rPr>
-                  <w:rFonts w:ascii="MS Gothic" w:eastAsia="MS Gothic" w:hAnsi="MS Gothic"/>
-                  <w:sz w:val="22"/>
-                </w:rPr>
-                <w14:checkbox>
-                  <w14:checked w14:val="0"/>
-                  <w14:checkedState w14:val="2612" w14:font="MS Gothic"/>
-                  <w14:uncheckedState w14:val="2610" w14:font="MS Gothic"/>
-                </w14:checkbox>
-              </w:sdtPr>
-              <w:sdtContent>
-                <w:r>
-                  <w:rPr>
-                    <w:rFonts w:ascii="MS Gothic" w:eastAsia="MS Gothic" w:hAnsi="MS Gothic"/>
-                    <w:sz w:val="22"/>
-                  </w:rPr>
-                  <w:t>☐</w:t>
-                </w:r>
-              </w:sdtContent>
-            </w:sdt>
-          </w:p>
-        </w:tc>
-        <w:tc>
-          <w:tcPr>
-            <w:tcW w:type="dxa" w:w="3009"/>
-          </w:tcPr>
-          <w:p>
-            <w:pPr>
-              <w:spacing w:before="40" w:after="40"/>
-            </w:pPr>
-            <w:r>
-              <w:rPr>
-                <w:rFonts w:ascii="Arial" w:hAnsi="Arial" w:cs="Arial" w:eastAsia="Arial"/>
-                <w:b w:val="0"/>
-                <w:i w:val="0"/>
-                <w:sz w:val="18"/>
-              </w:rPr>
-              <w:t>Deliverable: comparison table (latency, cost, quality) + checkpoint answers</w:t>
-            </w:r>
-          </w:p>
-        </w:tc>
-        <w:tc>
-          <w:tcPr>
-            <w:tcW w:type="dxa" w:w="3009"/>
-          </w:tcPr>
-          <w:p>
-            <w:pPr>
-              <w:spacing w:before="40" w:after="40"/>
-              <w:jc w:val="center"/>
-            </w:pPr>
-            <w:r>
-              <w:rPr>
-                <w:rFonts w:ascii="Arial" w:hAnsi="Arial" w:cs="Arial" w:eastAsia="Arial"/>
-                <w:b/>
-                <w:i w:val="0"/>
-                <w:color w:val="C05000"/>
-                <w:sz w:val="18"/>
-              </w:rPr>
-              <w:t>To do</w:t>
-            </w:r>
-          </w:p>
-        </w:tc>
-      </w:tr>
-      <w:tr>
-        <w:tc>
-          <w:tcPr>
-            <w:tcW w:type="dxa" w:w="3009"/>
-          </w:tcPr>
-          <w:p>
-            <w:pPr>
-              <w:spacing w:before="20" w:after="20"/>
-              <w:jc w:val="center"/>
-            </w:pPr>
-            <w:sdt>
-              <w:sdtPr>
-                <w:rPr>
-                  <w:rFonts w:ascii="MS Gothic" w:eastAsia="MS Gothic" w:hAnsi="MS Gothic"/>
-                  <w:sz w:val="22"/>
-                </w:rPr>
-                <w14:checkbox>
-                  <w14:checked w14:val="0"/>
-                  <w14:checkedState w14:val="2612" w14:font="MS Gothic"/>
-                  <w14:uncheckedState w14:val="2610" w14:font="MS Gothic"/>
-                </w14:checkbox>
-              </w:sdtPr>
-              <w:sdtContent>
-                <w:r>
-                  <w:rPr>
-                    <w:rFonts w:ascii="MS Gothic" w:eastAsia="MS Gothic" w:hAnsi="MS Gothic"/>
-                    <w:sz w:val="22"/>
-                  </w:rPr>
-                  <w:t>☐</w:t>
-                </w:r>
-              </w:sdtContent>
-            </w:sdt>
-          </w:p>
-        </w:tc>
-        <w:tc>
-          <w:tcPr>
-            <w:tcW w:type="dxa" w:w="3009"/>
-          </w:tcPr>
-          <w:p>
-            <w:pPr>
-              <w:spacing w:before="40" w:after="40"/>
-            </w:pPr>
-            <w:r>
-              <w:rPr>
-                <w:rFonts w:ascii="Arial" w:hAnsi="Arial" w:cs="Arial" w:eastAsia="Arial"/>
-                <w:b w:val="0"/>
-                <w:i w:val="0"/>
-                <w:sz w:val="18"/>
-              </w:rPr>
               <w:t>Screenshots added (yellow boxes below)</w:t>
             </w:r>
           </w:p>
@@ -1184,7 +1184,7 @@
           <w:i/>
           <w:sz w:val="17"/>
         </w:rPr>
-        <w:t>Progress: 2/10 items done</w:t>
+        <w:t>Progress: 9/10 items done</w:t>
       </w:r>
     </w:p>
     <w:p>
@@ -1531,7 +1531,7 @@
                 <w:i w:val="0"/>
                 <w:sz w:val="18"/>
               </w:rPr>
-              <w:t>Read the sheet and wrote down in my own words what an LLM, an API and a Jupyter notebook are, and what the difference is between running a model locally and in the cloud (top of my notebook).</w:t>
+              <w:t>Read the sheet: what an LLM, an API and a Jupyter notebook are, and running a model locally vs in the cloud.</w:t>
             </w:r>
           </w:p>
           <w:p>
@@ -1550,7 +1550,7 @@
                 <w:i w:val="0"/>
                 <w:sz w:val="18"/>
               </w:rPr>
-              <w:t xml:space="preserve">Made a Python virtual environment and installed </w:t>
+              <w:t>Made a separate Python environment for this lab (</w:t>
             </w:r>
             <w:r>
               <w:rPr>
@@ -1559,6 +1559,24 @@
                 <w:i w:val="0"/>
                 <w:sz w:val="17"/>
               </w:rPr>
+              <w:t>ollama_venv</w:t>
+            </w:r>
+            <w:r>
+              <w:rPr>
+                <w:rFonts w:ascii="Arial" w:hAnsi="Arial" w:cs="Arial" w:eastAsia="Arial"/>
+                <w:b w:val="0"/>
+                <w:i w:val="0"/>
+                <w:sz w:val="18"/>
+              </w:rPr>
+              <w:t xml:space="preserve">) and installed </w:t>
+            </w:r>
+            <w:r>
+              <w:rPr>
+                <w:rFonts w:ascii="Consolas" w:hAnsi="Consolas" w:cs="Consolas" w:eastAsia="Consolas"/>
+                <w:b w:val="0"/>
+                <w:i w:val="0"/>
+                <w:sz w:val="17"/>
+              </w:rPr>
               <w:t>ollama</w:t>
             </w:r>
             <w:r>
@@ -1604,7 +1622,7 @@
                 <w:i w:val="0"/>
                 <w:sz w:val="18"/>
               </w:rPr>
-              <w:t xml:space="preserve">, </w:t>
+              <w:t xml:space="preserve"> and </w:t>
             </w:r>
             <w:r>
               <w:rPr>
@@ -1614,24 +1632,6 @@
                 <w:sz w:val="17"/>
               </w:rPr>
               <w:t>gradio</w:t>
-            </w:r>
-            <w:r>
-              <w:rPr>
-                <w:rFonts w:ascii="Arial" w:hAnsi="Arial" w:cs="Arial" w:eastAsia="Arial"/>
-                <w:b w:val="0"/>
-                <w:i w:val="0"/>
-                <w:sz w:val="18"/>
-              </w:rPr>
-              <w:t xml:space="preserve"> and </w:t>
-            </w:r>
-            <w:r>
-              <w:rPr>
-                <w:rFonts w:ascii="Consolas" w:hAnsi="Consolas" w:cs="Consolas" w:eastAsia="Consolas"/>
-                <w:b w:val="0"/>
-                <w:i w:val="0"/>
-                <w:sz w:val="17"/>
-              </w:rPr>
-              <w:t>python-dotenv</w:t>
             </w:r>
             <w:r>
               <w:rPr>
@@ -1717,7 +1717,7 @@
                 <w:i w:val="0"/>
                 <w:sz w:val="17"/>
               </w:rPr>
-              <w:t>An API is just a way for my code to send a request (the prompt) and get a response (the answer).</w:t>
+              <w:t>An API is just a way for my code to send a request (the prompt) and get a response back.</w:t>
             </w:r>
           </w:p>
           <w:p>
@@ -1813,7 +1813,7 @@
                 <w:i w:val="0"/>
                 <w:sz w:val="18"/>
               </w:rPr>
-              <w:t xml:space="preserve">Installed the Ollama app and ran </w:t>
+              <w:t xml:space="preserve">Installed Ollama and downloaded the small </w:t>
             </w:r>
             <w:r>
               <w:rPr>
@@ -1822,7 +1822,7 @@
                 <w:i w:val="0"/>
                 <w:sz w:val="17"/>
               </w:rPr>
-              <w:t>ollama run llama3.2:1b</w:t>
+              <w:t>llama3.2:1b</w:t>
             </w:r>
             <w:r>
               <w:rPr>
@@ -1831,7 +1831,7 @@
                 <w:i w:val="0"/>
                 <w:sz w:val="18"/>
               </w:rPr>
-              <w:t xml:space="preserve"> in the terminal – it downloaded the model (1.3 GB) and I could chat with it straight away.</w:t>
+              <w:t xml:space="preserve"> model.</w:t>
             </w:r>
           </w:p>
           <w:p>
@@ -1859,7 +1859,7 @@
                 <w:i w:val="0"/>
                 <w:sz w:val="17"/>
               </w:rPr>
-              <w:t>ollama.chat()</w:t>
+              <w:t>ollama.chat(...)</w:t>
             </w:r>
             <w:r>
               <w:rPr>
@@ -1868,28 +1868,181 @@
                 <w:i w:val="0"/>
                 <w:sz w:val="18"/>
               </w:rPr>
-              <w:t xml:space="preserve"> – 'What is an intelligent system?' took </w:t>
-            </w:r>
-            <w:r>
-              <w:rPr>
-                <w:rFonts w:ascii="Arial" w:hAnsi="Arial" w:cs="Arial" w:eastAsia="Arial"/>
-                <w:b w:val="0"/>
-                <w:i w:val="0"/>
-                <w:sz w:val="18"/>
-                <w:highlight w:val="yellow"/>
-              </w:rPr>
-              <w:t>x.x</w:t>
-            </w:r>
-            <w:r>
-              <w:rPr>
-                <w:rFonts w:ascii="Arial" w:hAnsi="Arial" w:cs="Arial" w:eastAsia="Arial"/>
-                <w:b w:val="0"/>
-                <w:i w:val="0"/>
-                <w:sz w:val="18"/>
-              </w:rPr>
-              <w:t xml:space="preserve"> s.</w:t>
-            </w:r>
-          </w:p>
+              <w:t xml:space="preserve"> and asked 'What is an intelligent system?' – it answered with a long list of types, characteristics, uses and examples.</w:t>
+            </w:r>
+          </w:p>
+        </w:tc>
+        <w:tc>
+          <w:tcPr>
+            <w:tcW w:w="883" w:type="dxa"/>
+          </w:tcPr>
+          <w:p>
+            <w:pPr>
+              <w:spacing w:before="80" w:after="40"/>
+              <w:jc w:val="center"/>
+            </w:pPr>
+            <w:r>
+              <w:rPr>
+                <w:rFonts w:ascii="Arial" w:hAnsi="Arial" w:cs="Arial" w:eastAsia="Arial"/>
+                <w:b/>
+                <w:i w:val="0"/>
+                <w:sz w:val="19"/>
+              </w:rPr>
+              <w:t>1 h</w:t>
+            </w:r>
+          </w:p>
+        </w:tc>
+        <w:tc>
+          <w:tcPr>
+            <w:tcW w:w="2383" w:type="dxa"/>
+          </w:tcPr>
+          <w:p>
+            <w:pPr>
+              <w:spacing w:before="80" w:after="20"/>
+            </w:pPr>
+            <w:r>
+              <w:rPr>
+                <w:rFonts w:ascii="Arial" w:hAnsi="Arial" w:cs="Arial" w:eastAsia="Arial"/>
+                <w:b/>
+                <w:i w:val="0"/>
+                <w:sz w:val="19"/>
+              </w:rPr>
+              <w:t>Learning:</w:t>
+            </w:r>
+          </w:p>
+          <w:p>
+            <w:pPr>
+              <w:pStyle w:val="ListParagraph"/>
+              <w:numPr>
+                <w:ilvl w:val="0"/>
+                <w:numId w:val="1"/>
+              </w:numPr>
+              <w:spacing w:before="0" w:after="40"/>
+            </w:pPr>
+            <w:r>
+              <w:rPr>
+                <w:rFonts w:ascii="Arial" w:hAnsi="Arial" w:cs="Arial" w:eastAsia="Arial"/>
+                <w:b w:val="0"/>
+                <w:i w:val="0"/>
+                <w:sz w:val="17"/>
+              </w:rPr>
+              <w:t xml:space="preserve">Ollama runs a little server on my own laptop (localhost). The </w:t>
+            </w:r>
+            <w:r>
+              <w:rPr>
+                <w:rFonts w:ascii="Consolas" w:hAnsi="Consolas" w:cs="Consolas" w:eastAsia="Consolas"/>
+                <w:b w:val="0"/>
+                <w:i w:val="0"/>
+                <w:sz w:val="16"/>
+              </w:rPr>
+              <w:t>ollama</w:t>
+            </w:r>
+            <w:r>
+              <w:rPr>
+                <w:rFonts w:ascii="Arial" w:hAnsi="Arial" w:cs="Arial" w:eastAsia="Arial"/>
+                <w:b w:val="0"/>
+                <w:i w:val="0"/>
+                <w:sz w:val="17"/>
+              </w:rPr>
+              <w:t xml:space="preserve"> library just sends my prompt to it and gets the answer back as JSON – nothing leaves my computer.</w:t>
+            </w:r>
+          </w:p>
+          <w:p>
+            <w:pPr>
+              <w:pStyle w:val="ListParagraph"/>
+              <w:numPr>
+                <w:ilvl w:val="0"/>
+                <w:numId w:val="1"/>
+              </w:numPr>
+              <w:spacing w:before="0" w:after="40"/>
+            </w:pPr>
+            <w:r>
+              <w:rPr>
+                <w:rFonts w:ascii="Arial" w:hAnsi="Arial" w:cs="Arial" w:eastAsia="Arial"/>
+                <w:b w:val="0"/>
+                <w:i w:val="0"/>
+                <w:sz w:val="17"/>
+              </w:rPr>
+              <w:t>The model file is loaded into memory the first time, so the first call is the slowest.</w:t>
+            </w:r>
+          </w:p>
+          <w:p>
+            <w:pPr>
+              <w:spacing w:before="80" w:after="20"/>
+            </w:pPr>
+            <w:r>
+              <w:rPr>
+                <w:rFonts w:ascii="Arial" w:hAnsi="Arial" w:cs="Arial" w:eastAsia="Arial"/>
+                <w:b/>
+                <w:i w:val="0"/>
+                <w:sz w:val="19"/>
+              </w:rPr>
+              <w:t>Problems:</w:t>
+            </w:r>
+          </w:p>
+          <w:p>
+            <w:pPr>
+              <w:pStyle w:val="ListParagraph"/>
+              <w:numPr>
+                <w:ilvl w:val="0"/>
+                <w:numId w:val="1"/>
+              </w:numPr>
+              <w:spacing w:before="0" w:after="40"/>
+            </w:pPr>
+            <w:r>
+              <w:rPr>
+                <w:rFonts w:ascii="Arial" w:hAnsi="Arial" w:cs="Arial" w:eastAsia="Arial"/>
+                <w:b w:val="0"/>
+                <w:i w:val="0"/>
+                <w:sz w:val="17"/>
+              </w:rPr>
+              <w:t>The small model's answer was a bit generic and not always right – it listed 'self-awareness' as a common characteristic of intelligent systems.</w:t>
+            </w:r>
+          </w:p>
+        </w:tc>
+      </w:tr>
+      <w:tr>
+        <w:trPr>
+          <w:cantSplit/>
+          <w:trHeight w:val="595"/>
+        </w:trPr>
+        <w:tc>
+          <w:tcPr>
+            <w:tcW w:w="1555" w:type="dxa"/>
+          </w:tcPr>
+          <w:p>
+            <w:pPr>
+              <w:spacing w:before="80" w:after="40"/>
+            </w:pPr>
+            <w:r>
+              <w:rPr>
+                <w:rFonts w:ascii="Arial" w:hAnsi="Arial" w:cs="Arial" w:eastAsia="Arial"/>
+                <w:b/>
+                <w:i w:val="0"/>
+                <w:sz w:val="19"/>
+              </w:rPr>
+              <w:t>Cloud model – Gemini</w:t>
+            </w:r>
+          </w:p>
+          <w:p>
+            <w:pPr>
+              <w:spacing w:before="0" w:after="40"/>
+            </w:pPr>
+            <w:r>
+              <w:rPr>
+                <w:rFonts w:ascii="Arial" w:hAnsi="Arial" w:cs="Arial" w:eastAsia="Arial"/>
+                <w:b w:val="0"/>
+                <w:i/>
+                <w:sz w:val="17"/>
+              </w:rPr>
+              <w:t>Step 5</w:t>
+            </w:r>
+          </w:p>
+        </w:tc>
+        <w:tc>
+          <w:tcPr>
+            <w:tcW w:w="4144" w:type="dxa"/>
+          </w:tcPr>
           <w:p>
             <w:pPr>
               <w:pStyle w:val="ListParagraph"/>
@@ -1906,7 +2059,7 @@
                 <w:i w:val="0"/>
                 <w:sz w:val="18"/>
               </w:rPr>
-              <w:t xml:space="preserve">Looked under the hood: sent the same kind of request by hand with </w:t>
+              <w:t xml:space="preserve">Made a free API key in Google AI Studio and installed </w:t>
             </w:r>
             <w:r>
               <w:rPr>
@@ -1915,7 +2068,7 @@
                 <w:i w:val="0"/>
                 <w:sz w:val="17"/>
               </w:rPr>
-              <w:t>requests.post</w:t>
+              <w:t>google-genai</w:t>
             </w:r>
             <w:r>
               <w:rPr>
@@ -1924,7 +2077,26 @@
                 <w:i w:val="0"/>
                 <w:sz w:val="18"/>
               </w:rPr>
-              <w:t xml:space="preserve"> to </w:t>
+              <w:t>.</w:t>
+            </w:r>
+          </w:p>
+          <w:p>
+            <w:pPr>
+              <w:pStyle w:val="ListParagraph"/>
+              <w:numPr>
+                <w:ilvl w:val="0"/>
+                <w:numId w:val="1"/>
+              </w:numPr>
+              <w:spacing w:before="0" w:after="60"/>
+            </w:pPr>
+            <w:r>
+              <w:rPr>
+                <w:rFonts w:ascii="Arial" w:hAnsi="Arial" w:cs="Arial" w:eastAsia="Arial"/>
+                <w:b w:val="0"/>
+                <w:i w:val="0"/>
+                <w:sz w:val="18"/>
+              </w:rPr>
+              <w:t xml:space="preserve">Asked </w:t>
             </w:r>
             <w:r>
               <w:rPr>
@@ -1933,7 +2105,7 @@
                 <w:i w:val="0"/>
                 <w:sz w:val="17"/>
               </w:rPr>
-              <w:t>localhost:11434</w:t>
+              <w:t>gemini-3.5-flash</w:t>
             </w:r>
             <w:r>
               <w:rPr>
@@ -1942,7 +2114,7 @@
                 <w:i w:val="0"/>
                 <w:sz w:val="18"/>
               </w:rPr>
-              <w:t xml:space="preserve"> and got plain JSON back (status 200).</w:t>
+              <w:t xml:space="preserve"> the same question – a well organised answer (perceive → reason → learn → act, key characteristics, real examples, the technologies behind it).</w:t>
             </w:r>
           </w:p>
         </w:tc>
@@ -1962,7 +2134,7 @@
                 <w:i w:val="0"/>
                 <w:sz w:val="19"/>
               </w:rPr>
-              <w:t>1 h</w:t>
+              <w:t>0.5 h</w:t>
             </w:r>
           </w:p>
         </w:tc>
@@ -2000,7 +2172,21 @@
                 <w:i w:val="0"/>
                 <w:sz w:val="17"/>
               </w:rPr>
-              <w:t>Ollama is a little web server running on my own laptop – the Python library just sends it requests.</w:t>
+              <w:t>Cloud = nothing to download and a much bigger model, but every request goes over the internet and needs the key.</w:t>
+            </w:r>
+          </w:p>
+          <w:p>
+            <w:pPr>
+              <w:spacing w:before="80" w:after="20"/>
+            </w:pPr>
+            <w:r>
+              <w:rPr>
+                <w:rFonts w:ascii="Arial" w:hAnsi="Arial" w:cs="Arial" w:eastAsia="Arial"/>
+                <w:b/>
+                <w:i w:val="0"/>
+                <w:sz w:val="19"/>
+              </w:rPr>
+              <w:t>Problems:</w:t>
             </w:r>
           </w:p>
           <w:p>
@@ -2019,45 +2205,255 @@
                 <w:i w:val="0"/>
                 <w:sz w:val="17"/>
               </w:rPr>
-              <w:t xml:space="preserve">The model is 1.2B parameters squeezed down to 8 bits (Q8_0) so it fits in about </w:t>
-            </w:r>
-            <w:r>
-              <w:rPr>
-                <w:rFonts w:ascii="Arial" w:hAnsi="Arial" w:cs="Arial" w:eastAsia="Arial"/>
-                <w:b w:val="0"/>
-                <w:i w:val="0"/>
-                <w:sz w:val="17"/>
-                <w:highlight w:val="yellow"/>
-              </w:rPr>
-              <w:t>x</w:t>
-            </w:r>
-            <w:r>
-              <w:rPr>
-                <w:rFonts w:ascii="Arial" w:hAnsi="Arial" w:cs="Arial" w:eastAsia="Arial"/>
-                <w:b w:val="0"/>
-                <w:i w:val="0"/>
-                <w:sz w:val="17"/>
-              </w:rPr>
-              <w:t xml:space="preserve"> GB of memory. It wrote about </w:t>
-            </w:r>
-            <w:r>
-              <w:rPr>
-                <w:rFonts w:ascii="Arial" w:hAnsi="Arial" w:cs="Arial" w:eastAsia="Arial"/>
-                <w:b w:val="0"/>
-                <w:i w:val="0"/>
-                <w:sz w:val="17"/>
-                <w:highlight w:val="yellow"/>
-              </w:rPr>
-              <w:t>xx</w:t>
-            </w:r>
-            <w:r>
-              <w:rPr>
-                <w:rFonts w:ascii="Arial" w:hAnsi="Arial" w:cs="Arial" w:eastAsia="Arial"/>
-                <w:b w:val="0"/>
-                <w:i w:val="0"/>
-                <w:sz w:val="17"/>
-              </w:rPr>
-              <w:t xml:space="preserve"> tokens a second on my laptop.</w:t>
+              <w:t xml:space="preserve">I first typed the API key straight into the notebook. That's not safe (anyone who sees the notebook or my GitHub can use it), so I took it out of the copy I hand in – it should come from an environment variable / </w:t>
+            </w:r>
+            <w:r>
+              <w:rPr>
+                <w:rFonts w:ascii="Consolas" w:hAnsi="Consolas" w:cs="Consolas" w:eastAsia="Consolas"/>
+                <w:b w:val="0"/>
+                <w:i w:val="0"/>
+                <w:sz w:val="16"/>
+              </w:rPr>
+              <w:t>.env</w:t>
+            </w:r>
+            <w:r>
+              <w:rPr>
+                <w:rFonts w:ascii="Arial" w:hAnsi="Arial" w:cs="Arial" w:eastAsia="Arial"/>
+                <w:b w:val="0"/>
+                <w:i w:val="0"/>
+                <w:sz w:val="17"/>
+              </w:rPr>
+              <w:t xml:space="preserve"> file instead.</w:t>
+            </w:r>
+          </w:p>
+        </w:tc>
+      </w:tr>
+      <w:tr>
+        <w:trPr>
+          <w:cantSplit/>
+          <w:trHeight w:val="595"/>
+        </w:trPr>
+        <w:tc>
+          <w:tcPr>
+            <w:tcW w:w="1555" w:type="dxa"/>
+          </w:tcPr>
+          <w:p>
+            <w:pPr>
+              <w:spacing w:before="80" w:after="40"/>
+            </w:pPr>
+            <w:r>
+              <w:rPr>
+                <w:rFonts w:ascii="Arial" w:hAnsi="Arial" w:cs="Arial" w:eastAsia="Arial"/>
+                <w:b/>
+                <w:i w:val="0"/>
+                <w:sz w:val="19"/>
+              </w:rPr>
+              <w:t>Same prompt on both models</w:t>
+            </w:r>
+          </w:p>
+          <w:p>
+            <w:pPr>
+              <w:spacing w:before="0" w:after="40"/>
+            </w:pPr>
+            <w:r>
+              <w:rPr>
+                <w:rFonts w:ascii="Arial" w:hAnsi="Arial" w:cs="Arial" w:eastAsia="Arial"/>
+                <w:b w:val="0"/>
+                <w:i/>
+                <w:sz w:val="17"/>
+              </w:rPr>
+              <w:t xml:space="preserve">Steps 6–7, </w:t>
+            </w:r>
+            <w:r>
+              <w:rPr>
+                <w:rFonts w:ascii="Consolas" w:hAnsi="Consolas" w:cs="Consolas" w:eastAsia="Consolas"/>
+                <w:b w:val="0"/>
+                <w:i/>
+                <w:sz w:val="16"/>
+              </w:rPr>
+              <w:t>student-mat.csv</w:t>
+            </w:r>
+          </w:p>
+        </w:tc>
+        <w:tc>
+          <w:tcPr>
+            <w:tcW w:w="4144" w:type="dxa"/>
+          </w:tcPr>
+          <w:p>
+            <w:pPr>
+              <w:pStyle w:val="ListParagraph"/>
+              <w:numPr>
+                <w:ilvl w:val="0"/>
+                <w:numId w:val="1"/>
+              </w:numPr>
+              <w:spacing w:before="0" w:after="60"/>
+            </w:pPr>
+            <w:r>
+              <w:rPr>
+                <w:rFonts w:ascii="Arial" w:hAnsi="Arial" w:cs="Arial" w:eastAsia="Arial"/>
+                <w:b w:val="0"/>
+                <w:i w:val="0"/>
+                <w:sz w:val="18"/>
+              </w:rPr>
+              <w:t xml:space="preserve">Loaded </w:t>
+            </w:r>
+            <w:r>
+              <w:rPr>
+                <w:rFonts w:ascii="Consolas" w:hAnsi="Consolas" w:cs="Consolas" w:eastAsia="Consolas"/>
+                <w:b w:val="0"/>
+                <w:i w:val="0"/>
+                <w:sz w:val="17"/>
+              </w:rPr>
+              <w:t>student-mat.csv</w:t>
+            </w:r>
+            <w:r>
+              <w:rPr>
+                <w:rFonts w:ascii="Arial" w:hAnsi="Arial" w:cs="Arial" w:eastAsia="Arial"/>
+                <w:b w:val="0"/>
+                <w:i w:val="0"/>
+                <w:sz w:val="18"/>
+              </w:rPr>
+              <w:t xml:space="preserve"> (student performance data) with pandas and kept the first 20 rows like the sheet does.</w:t>
+            </w:r>
+          </w:p>
+          <w:p>
+            <w:pPr>
+              <w:pStyle w:val="ListParagraph"/>
+              <w:numPr>
+                <w:ilvl w:val="0"/>
+                <w:numId w:val="1"/>
+              </w:numPr>
+              <w:spacing w:before="0" w:after="60"/>
+            </w:pPr>
+            <w:r>
+              <w:rPr>
+                <w:rFonts w:ascii="Arial" w:hAnsi="Arial" w:cs="Arial" w:eastAsia="Arial"/>
+                <w:b w:val="0"/>
+                <w:i w:val="0"/>
+                <w:sz w:val="18"/>
+              </w:rPr>
+              <w:t xml:space="preserve">Asked both models how many Male and Female students are in the </w:t>
+            </w:r>
+            <w:r>
+              <w:rPr>
+                <w:rFonts w:ascii="Consolas" w:hAnsi="Consolas" w:cs="Consolas" w:eastAsia="Consolas"/>
+                <w:b w:val="0"/>
+                <w:i w:val="0"/>
+                <w:sz w:val="17"/>
+              </w:rPr>
+              <w:t>sex</w:t>
+            </w:r>
+            <w:r>
+              <w:rPr>
+                <w:rFonts w:ascii="Arial" w:hAnsi="Arial" w:cs="Arial" w:eastAsia="Arial"/>
+                <w:b w:val="0"/>
+                <w:i w:val="0"/>
+                <w:sz w:val="18"/>
+              </w:rPr>
+              <w:t xml:space="preserve"> column, with a </w:t>
+            </w:r>
+            <w:r>
+              <w:rPr>
+                <w:rFonts w:ascii="Consolas" w:hAnsi="Consolas" w:cs="Consolas" w:eastAsia="Consolas"/>
+                <w:b w:val="0"/>
+                <w:i w:val="0"/>
+                <w:sz w:val="17"/>
+              </w:rPr>
+              <w:t>time.time()</w:t>
+            </w:r>
+            <w:r>
+              <w:rPr>
+                <w:rFonts w:ascii="Arial" w:hAnsi="Arial" w:cs="Arial" w:eastAsia="Arial"/>
+                <w:b w:val="0"/>
+                <w:i w:val="0"/>
+                <w:sz w:val="18"/>
+              </w:rPr>
+              <w:t xml:space="preserve"> wrapper inside each function to log the latency.</w:t>
+            </w:r>
+          </w:p>
+          <w:p>
+            <w:pPr>
+              <w:pStyle w:val="ListParagraph"/>
+              <w:numPr>
+                <w:ilvl w:val="0"/>
+                <w:numId w:val="1"/>
+              </w:numPr>
+              <w:spacing w:before="0" w:after="60"/>
+            </w:pPr>
+            <w:r>
+              <w:rPr>
+                <w:rFonts w:ascii="Arial" w:hAnsi="Arial" w:cs="Arial" w:eastAsia="Arial"/>
+                <w:b/>
+                <w:i w:val="0"/>
+                <w:sz w:val="18"/>
+              </w:rPr>
+              <w:t>Ollama: 1.32 s</w:t>
+            </w:r>
+            <w:r>
+              <w:rPr>
+                <w:rFonts w:ascii="Arial" w:hAnsi="Arial" w:cs="Arial" w:eastAsia="Arial"/>
+                <w:b w:val="0"/>
+                <w:i w:val="0"/>
+                <w:sz w:val="18"/>
+              </w:rPr>
+              <w:t xml:space="preserve"> – said 8 F and 9 M (only 17 of 20) and then swapped them in its last sentence. </w:t>
+            </w:r>
+            <w:r>
+              <w:rPr>
+                <w:rFonts w:ascii="Arial" w:hAnsi="Arial" w:cs="Arial" w:eastAsia="Arial"/>
+                <w:b/>
+                <w:i w:val="0"/>
+                <w:sz w:val="18"/>
+              </w:rPr>
+              <w:t>Gemini: 3.18 s</w:t>
+            </w:r>
+            <w:r>
+              <w:rPr>
+                <w:rFonts w:ascii="Arial" w:hAnsi="Arial" w:cs="Arial" w:eastAsia="Arial"/>
+                <w:b w:val="0"/>
+                <w:i w:val="0"/>
+                <w:sz w:val="18"/>
+              </w:rPr>
+              <w:t xml:space="preserve"> – 11 F and 9 M = 20, which is right (Fig 1.1).</w:t>
+            </w:r>
+          </w:p>
+        </w:tc>
+        <w:tc>
+          <w:tcPr>
+            <w:tcW w:w="883" w:type="dxa"/>
+          </w:tcPr>
+          <w:p>
+            <w:pPr>
+              <w:spacing w:before="80" w:after="40"/>
+              <w:jc w:val="center"/>
+            </w:pPr>
+            <w:r>
+              <w:rPr>
+                <w:rFonts w:ascii="Arial" w:hAnsi="Arial" w:cs="Arial" w:eastAsia="Arial"/>
+                <w:b/>
+                <w:i w:val="0"/>
+                <w:sz w:val="19"/>
+              </w:rPr>
+              <w:t>1 h</w:t>
+            </w:r>
+          </w:p>
+        </w:tc>
+        <w:tc>
+          <w:tcPr>
+            <w:tcW w:w="2383" w:type="dxa"/>
+          </w:tcPr>
+          <w:p>
+            <w:pPr>
+              <w:spacing w:before="80" w:after="20"/>
+            </w:pPr>
+            <w:r>
+              <w:rPr>
+                <w:rFonts w:ascii="Arial" w:hAnsi="Arial" w:cs="Arial" w:eastAsia="Arial"/>
+                <w:b/>
+                <w:i w:val="0"/>
+                <w:sz w:val="19"/>
+              </w:rPr>
+              <w:t>Learning:</w:t>
             </w:r>
           </w:p>
           <w:p>
@@ -2076,21 +2472,7 @@
                 <w:i w:val="0"/>
                 <w:sz w:val="17"/>
               </w:rPr>
-              <w:t>The first call is the slowest because the model has to be loaded into memory first.</w:t>
-            </w:r>
-          </w:p>
-          <w:p>
-            <w:pPr>
-              <w:spacing w:before="80" w:after="20"/>
-            </w:pPr>
-            <w:r>
-              <w:rPr>
-                <w:rFonts w:ascii="Arial" w:hAnsi="Arial" w:cs="Arial" w:eastAsia="Arial"/>
-                <w:b/>
-                <w:i w:val="0"/>
-                <w:sz w:val="19"/>
-              </w:rPr>
-              <w:t>Problems:</w:t>
+              <w:t>Local was faster here (no internet in between), but fast and wrong isn't much use.</w:t>
             </w:r>
           </w:p>
           <w:p>
@@ -2109,7 +2491,58 @@
                 <w:i w:val="0"/>
                 <w:sz w:val="17"/>
               </w:rPr>
-              <w:t>None really for this one.</w:t>
+              <w:t>LLMs don't really count – they read the list as tokens. For counting, pandas (</w:t>
+            </w:r>
+            <w:r>
+              <w:rPr>
+                <w:rFonts w:ascii="Consolas" w:hAnsi="Consolas" w:cs="Consolas" w:eastAsia="Consolas"/>
+                <w:b w:val="0"/>
+                <w:i w:val="0"/>
+                <w:sz w:val="16"/>
+              </w:rPr>
+              <w:t>value_counts()</w:t>
+            </w:r>
+            <w:r>
+              <w:rPr>
+                <w:rFonts w:ascii="Arial" w:hAnsi="Arial" w:cs="Arial" w:eastAsia="Arial"/>
+                <w:b w:val="0"/>
+                <w:i w:val="0"/>
+                <w:sz w:val="17"/>
+              </w:rPr>
+              <w:t>) is the right tool.</w:t>
+            </w:r>
+          </w:p>
+          <w:p>
+            <w:pPr>
+              <w:spacing w:before="80" w:after="20"/>
+            </w:pPr>
+            <w:r>
+              <w:rPr>
+                <w:rFonts w:ascii="Arial" w:hAnsi="Arial" w:cs="Arial" w:eastAsia="Arial"/>
+                <w:b/>
+                <w:i w:val="0"/>
+                <w:sz w:val="19"/>
+              </w:rPr>
+              <w:t>Problems:</w:t>
+            </w:r>
+          </w:p>
+          <w:p>
+            <w:pPr>
+              <w:pStyle w:val="ListParagraph"/>
+              <w:numPr>
+                <w:ilvl w:val="0"/>
+                <w:numId w:val="1"/>
+              </w:numPr>
+              <w:spacing w:before="0" w:after="40"/>
+            </w:pPr>
+            <w:r>
+              <w:rPr>
+                <w:rFonts w:ascii="Arial" w:hAnsi="Arial" w:cs="Arial" w:eastAsia="Arial"/>
+                <w:b w:val="0"/>
+                <w:i w:val="0"/>
+                <w:sz w:val="17"/>
+              </w:rPr>
+              <w:t>The local model got the count wrong and contradicted itself in the same answer.</w:t>
             </w:r>
           </w:p>
         </w:tc>
@@ -2134,7 +2567,7 @@
                 <w:i w:val="0"/>
                 <w:sz w:val="19"/>
               </w:rPr>
-              <w:t>Cloud model – Gemini</w:t>
+              <w:t>Think step by step vs direct</w:t>
             </w:r>
           </w:p>
           <w:p>
@@ -2148,7 +2581,7 @@
                 <w:i/>
                 <w:sz w:val="17"/>
               </w:rPr>
-              <w:t>Step 5</w:t>
+              <w:t>Step 8</w:t>
             </w:r>
           </w:p>
         </w:tc>
@@ -2172,25 +2605,7 @@
                 <w:i w:val="0"/>
                 <w:sz w:val="18"/>
               </w:rPr>
-              <w:t xml:space="preserve">Made a free API key in Google AI Studio and put it in a </w:t>
-            </w:r>
-            <w:r>
-              <w:rPr>
-                <w:rFonts w:ascii="Consolas" w:hAnsi="Consolas" w:cs="Consolas" w:eastAsia="Consolas"/>
-                <w:b w:val="0"/>
-                <w:i w:val="0"/>
-                <w:sz w:val="17"/>
-              </w:rPr>
-              <w:t>.env</w:t>
-            </w:r>
-            <w:r>
-              <w:rPr>
-                <w:rFonts w:ascii="Arial" w:hAnsi="Arial" w:cs="Arial" w:eastAsia="Arial"/>
-                <w:b w:val="0"/>
-                <w:i w:val="0"/>
-                <w:sz w:val="18"/>
-              </w:rPr>
-              <w:t xml:space="preserve"> file (git ignores it) instead of typing it into the code like the sheet does.</w:t>
+              <w:t>Asked the apple question (3 boxes of 12, 5 rotten) once with 'Think step by step, then give your final answer' and once without it, on both models.</w:t>
             </w:r>
           </w:p>
           <w:p>
@@ -2209,25 +2624,16 @@
                 <w:i w:val="0"/>
                 <w:sz w:val="18"/>
               </w:rPr>
-              <w:t xml:space="preserve">Ran the same question on </w:t>
-            </w:r>
-            <w:r>
-              <w:rPr>
-                <w:rFonts w:ascii="Consolas" w:hAnsi="Consolas" w:cs="Consolas" w:eastAsia="Consolas"/>
-                <w:b w:val="0"/>
-                <w:i w:val="0"/>
-                <w:sz w:val="17"/>
-              </w:rPr>
-              <w:t>gemini-3.5-flash</w:t>
-            </w:r>
-            <w:r>
-              <w:rPr>
-                <w:rFonts w:ascii="Arial" w:hAnsi="Arial" w:cs="Arial" w:eastAsia="Arial"/>
-                <w:b w:val="0"/>
+              <w:t xml:space="preserve">All four answers were </w:t>
+            </w:r>
+            <w:r>
+              <w:rPr>
+                <w:rFonts w:ascii="Arial" w:hAnsi="Arial" w:cs="Arial" w:eastAsia="Arial"/>
+                <w:b/>
                 <w:i w:val="0"/>
                 <w:sz w:val="18"/>
               </w:rPr>
-              <w:t xml:space="preserve"> – took </w:t>
+              <w:t>31</w:t>
             </w:r>
             <w:r>
               <w:rPr>
@@ -2235,56 +2641,8 @@
                 <w:b w:val="0"/>
                 <w:i w:val="0"/>
                 <w:sz w:val="18"/>
-                <w:highlight w:val="yellow"/>
-              </w:rPr>
-              <w:t>x.x</w:t>
-            </w:r>
-            <w:r>
-              <w:rPr>
-                <w:rFonts w:ascii="Arial" w:hAnsi="Arial" w:cs="Arial" w:eastAsia="Arial"/>
-                <w:b w:val="0"/>
-                <w:i w:val="0"/>
-                <w:sz w:val="18"/>
-              </w:rPr>
-              <w:t xml:space="preserve"> s and gave a </w:t>
-            </w:r>
-            <w:r>
-              <w:rPr>
-                <w:rFonts w:ascii="Arial" w:hAnsi="Arial" w:cs="Arial" w:eastAsia="Arial"/>
-                <w:b w:val="0"/>
-                <w:i w:val="0"/>
-                <w:sz w:val="18"/>
-                <w:highlight w:val="yellow"/>
-              </w:rPr>
-              <w:t>xxx</w:t>
-            </w:r>
-            <w:r>
-              <w:rPr>
-                <w:rFonts w:ascii="Arial" w:hAnsi="Arial" w:cs="Arial" w:eastAsia="Arial"/>
-                <w:b w:val="0"/>
-                <w:i w:val="0"/>
-                <w:sz w:val="18"/>
-              </w:rPr>
-              <w:t xml:space="preserve">-word answer (local: </w:t>
-            </w:r>
-            <w:r>
-              <w:rPr>
-                <w:rFonts w:ascii="Arial" w:hAnsi="Arial" w:cs="Arial" w:eastAsia="Arial"/>
-                <w:b w:val="0"/>
-                <w:i w:val="0"/>
-                <w:sz w:val="18"/>
-                <w:highlight w:val="yellow"/>
-              </w:rPr>
-              <w:t>xxx</w:t>
-            </w:r>
-            <w:r>
-              <w:rPr>
-                <w:rFonts w:ascii="Arial" w:hAnsi="Arial" w:cs="Arial" w:eastAsia="Arial"/>
-                <w:b w:val="0"/>
-                <w:i w:val="0"/>
-                <w:sz w:val="18"/>
-              </w:rPr>
-              <w:t xml:space="preserve"> words).</w:t>
+              </w:rPr>
+              <w:t xml:space="preserve"> (right). Ollama: 1.07 s step by step vs 0.91 s direct. Gemini: 2.09 s vs 1.67 s.</w:t>
             </w:r>
           </w:p>
         </w:tc>
@@ -2342,7 +2700,7 @@
                 <w:i w:val="0"/>
                 <w:sz w:val="17"/>
               </w:rPr>
-              <w:t>Cloud = nothing to download and a much bigger model, but every request goes over the internet and needs the key – so the key has to stay secret.</w:t>
+              <w:t>For an easy question it made no difference to the answer – both models explained their working even without being asked. The direct prompt was just a bit faster.</w:t>
             </w:r>
           </w:p>
           <w:p>
@@ -2361,26 +2719,7 @@
                 <w:i w:val="0"/>
                 <w:sz w:val="17"/>
               </w:rPr>
-              <w:t xml:space="preserve">Gemini 'thinks' before it answers even if you don't ask – </w:t>
-            </w:r>
-            <w:r>
-              <w:rPr>
-                <w:rFonts w:ascii="Arial" w:hAnsi="Arial" w:cs="Arial" w:eastAsia="Arial"/>
-                <w:b w:val="0"/>
-                <w:i w:val="0"/>
-                <w:sz w:val="17"/>
-                <w:highlight w:val="yellow"/>
-              </w:rPr>
-              <w:t>xxx</w:t>
-            </w:r>
-            <w:r>
-              <w:rPr>
-                <w:rFonts w:ascii="Arial" w:hAnsi="Arial" w:cs="Arial" w:eastAsia="Arial"/>
-                <w:b w:val="0"/>
-                <w:i w:val="0"/>
-                <w:sz w:val="17"/>
-              </w:rPr>
-              <w:t xml:space="preserve"> hidden thinking tokens on this question, which also count towards your usage.</w:t>
+              <w:t>My 'direct' prompt only left out 'think step by step'. Asking for 'the number only' would probably show a bigger difference.</w:t>
             </w:r>
           </w:p>
           <w:p>
@@ -2413,7 +2752,7 @@
                 <w:i w:val="0"/>
                 <w:sz w:val="17"/>
               </w:rPr>
-              <w:t>A yellow warning about 'automatic function calling' came up on the first Gemini call – it's just the library being chatty, nothing broke.</w:t>
+              <w:t>None really for this one.</w:t>
             </w:r>
           </w:p>
         </w:tc>
@@ -2438,7 +2777,7 @@
                 <w:i w:val="0"/>
                 <w:sz w:val="19"/>
               </w:rPr>
-              <w:t>Same prompts on both models</w:t>
+              <w:t>Chat demo with Gradio</w:t>
             </w:r>
           </w:p>
           <w:p>
@@ -2452,16 +2791,7 @@
                 <w:i/>
                 <w:sz w:val="17"/>
               </w:rPr>
-              <w:t xml:space="preserve">Steps 6–7, </w:t>
-            </w:r>
-            <w:r>
-              <w:rPr>
-                <w:rFonts w:ascii="Consolas" w:hAnsi="Consolas" w:cs="Consolas" w:eastAsia="Consolas"/>
-                <w:b w:val="0"/>
-                <w:i/>
-                <w:sz w:val="16"/>
-              </w:rPr>
-              <w:t>reviews.csv</w:t>
+              <w:t>Step 9</w:t>
             </w:r>
           </w:p>
         </w:tc>
@@ -2485,7 +2815,7 @@
                 <w:i w:val="0"/>
                 <w:sz w:val="18"/>
               </w:rPr>
-              <w:t xml:space="preserve">Loaded </w:t>
+              <w:t xml:space="preserve">Made a chat page with Gradio's </w:t>
             </w:r>
             <w:r>
               <w:rPr>
@@ -2494,7 +2824,7 @@
                 <w:i w:val="0"/>
                 <w:sz w:val="17"/>
               </w:rPr>
-              <w:t>reviews.csv</w:t>
+              <w:t>ChatInterface</w:t>
             </w:r>
             <w:r>
               <w:rPr>
@@ -2503,9 +2833,254 @@
                 <w:i w:val="0"/>
                 <w:sz w:val="18"/>
               </w:rPr>
-              <w:t xml:space="preserve"> – 99 movie reviews, about 213 words each.</w:t>
-            </w:r>
-          </w:p>
+              <w:t xml:space="preserve"> ('Week 1: Local LLM Chat (Ollama)') that sends my message to the local model.</w:t>
+            </w:r>
+          </w:p>
+        </w:tc>
+        <w:tc>
+          <w:tcPr>
+            <w:tcW w:w="883" w:type="dxa"/>
+          </w:tcPr>
+          <w:p>
+            <w:pPr>
+              <w:spacing w:before="80" w:after="40"/>
+              <w:jc w:val="center"/>
+            </w:pPr>
+            <w:r>
+              <w:rPr>
+                <w:rFonts w:ascii="Arial" w:hAnsi="Arial" w:cs="Arial" w:eastAsia="Arial"/>
+                <w:b/>
+                <w:i w:val="0"/>
+                <w:sz w:val="19"/>
+              </w:rPr>
+              <w:t>0.5 h</w:t>
+            </w:r>
+          </w:p>
+        </w:tc>
+        <w:tc>
+          <w:tcPr>
+            <w:tcW w:w="2383" w:type="dxa"/>
+          </w:tcPr>
+          <w:p>
+            <w:pPr>
+              <w:spacing w:before="80" w:after="20"/>
+            </w:pPr>
+            <w:r>
+              <w:rPr>
+                <w:rFonts w:ascii="Arial" w:hAnsi="Arial" w:cs="Arial" w:eastAsia="Arial"/>
+                <w:b/>
+                <w:i w:val="0"/>
+                <w:sz w:val="19"/>
+              </w:rPr>
+              <w:t>Learning:</w:t>
+            </w:r>
+          </w:p>
+          <w:p>
+            <w:pPr>
+              <w:pStyle w:val="ListParagraph"/>
+              <w:numPr>
+                <w:ilvl w:val="0"/>
+                <w:numId w:val="1"/>
+              </w:numPr>
+              <w:spacing w:before="0" w:after="40"/>
+            </w:pPr>
+            <w:r>
+              <w:rPr>
+                <w:rFonts w:ascii="Arial" w:hAnsi="Arial" w:cs="Arial" w:eastAsia="Arial"/>
+                <w:b w:val="0"/>
+                <w:i w:val="0"/>
+                <w:sz w:val="17"/>
+              </w:rPr>
+              <w:t>Gradio turns a normal Python function into a web page in a few lines.</w:t>
+            </w:r>
+          </w:p>
+          <w:p>
+            <w:pPr>
+              <w:spacing w:before="80" w:after="20"/>
+            </w:pPr>
+            <w:r>
+              <w:rPr>
+                <w:rFonts w:ascii="Arial" w:hAnsi="Arial" w:cs="Arial" w:eastAsia="Arial"/>
+                <w:b/>
+                <w:i w:val="0"/>
+                <w:sz w:val="19"/>
+              </w:rPr>
+              <w:t>Problems:</w:t>
+            </w:r>
+          </w:p>
+          <w:p>
+            <w:pPr>
+              <w:pStyle w:val="ListParagraph"/>
+              <w:numPr>
+                <w:ilvl w:val="0"/>
+                <w:numId w:val="1"/>
+              </w:numPr>
+              <w:spacing w:before="0" w:after="40"/>
+            </w:pPr>
+            <w:r>
+              <w:rPr>
+                <w:rFonts w:ascii="Arial" w:hAnsi="Arial" w:cs="Arial" w:eastAsia="Arial"/>
+                <w:b w:val="0"/>
+                <w:i w:val="0"/>
+                <w:sz w:val="17"/>
+              </w:rPr>
+              <w:t xml:space="preserve">My function only sends the newest message (it ignores </w:t>
+            </w:r>
+            <w:r>
+              <w:rPr>
+                <w:rFonts w:ascii="Consolas" w:hAnsi="Consolas" w:cs="Consolas" w:eastAsia="Consolas"/>
+                <w:b w:val="0"/>
+                <w:i w:val="0"/>
+                <w:sz w:val="16"/>
+              </w:rPr>
+              <w:t>history</w:t>
+            </w:r>
+            <w:r>
+              <w:rPr>
+                <w:rFonts w:ascii="Arial" w:hAnsi="Arial" w:cs="Arial" w:eastAsia="Arial"/>
+                <w:b w:val="0"/>
+                <w:i w:val="0"/>
+                <w:sz w:val="17"/>
+              </w:rPr>
+              <w:t xml:space="preserve">), so the chat doesn't remember what I said before – I'd have to pass the history to </w:t>
+            </w:r>
+            <w:r>
+              <w:rPr>
+                <w:rFonts w:ascii="Consolas" w:hAnsi="Consolas" w:cs="Consolas" w:eastAsia="Consolas"/>
+                <w:b w:val="0"/>
+                <w:i w:val="0"/>
+                <w:sz w:val="16"/>
+              </w:rPr>
+              <w:t>ollama.chat</w:t>
+            </w:r>
+            <w:r>
+              <w:rPr>
+                <w:rFonts w:ascii="Arial" w:hAnsi="Arial" w:cs="Arial" w:eastAsia="Arial"/>
+                <w:b w:val="0"/>
+                <w:i w:val="0"/>
+                <w:sz w:val="17"/>
+              </w:rPr>
+              <w:t xml:space="preserve"> for that.</w:t>
+            </w:r>
+          </w:p>
+          <w:p>
+            <w:pPr>
+              <w:pStyle w:val="ListParagraph"/>
+              <w:numPr>
+                <w:ilvl w:val="0"/>
+                <w:numId w:val="1"/>
+              </w:numPr>
+              <w:spacing w:before="0" w:after="40"/>
+            </w:pPr>
+            <w:r>
+              <w:rPr>
+                <w:rFonts w:ascii="Arial" w:hAnsi="Arial" w:cs="Arial" w:eastAsia="Arial"/>
+                <w:b w:val="0"/>
+                <w:i w:val="0"/>
+                <w:sz w:val="17"/>
+              </w:rPr>
+              <w:t>Importing gradio printed a 'TqdmWarning: IProgress not found' – harmless.</w:t>
+            </w:r>
+          </w:p>
+          <w:p>
+            <w:pPr>
+              <w:pStyle w:val="ListParagraph"/>
+              <w:numPr>
+                <w:ilvl w:val="0"/>
+                <w:numId w:val="1"/>
+              </w:numPr>
+              <w:spacing w:before="0" w:after="40"/>
+            </w:pPr>
+            <w:r>
+              <w:rPr>
+                <w:rFonts w:ascii="Arial" w:hAnsi="Arial" w:cs="Arial" w:eastAsia="Arial"/>
+                <w:b w:val="0"/>
+                <w:i w:val="0"/>
+                <w:sz w:val="17"/>
+              </w:rPr>
+              <w:t xml:space="preserve">The sheet says </w:t>
+            </w:r>
+            <w:r>
+              <w:rPr>
+                <w:rFonts w:ascii="Consolas" w:hAnsi="Consolas" w:cs="Consolas" w:eastAsia="Consolas"/>
+                <w:b w:val="0"/>
+                <w:i w:val="0"/>
+                <w:sz w:val="16"/>
+              </w:rPr>
+              <w:t>GradioUI</w:t>
+            </w:r>
+            <w:r>
+              <w:rPr>
+                <w:rFonts w:ascii="Arial" w:hAnsi="Arial" w:cs="Arial" w:eastAsia="Arial"/>
+                <w:b w:val="0"/>
+                <w:i w:val="0"/>
+                <w:sz w:val="17"/>
+              </w:rPr>
+              <w:t xml:space="preserve">, but that's from smolagents (next week), so I used Gradio's own </w:t>
+            </w:r>
+            <w:r>
+              <w:rPr>
+                <w:rFonts w:ascii="Consolas" w:hAnsi="Consolas" w:cs="Consolas" w:eastAsia="Consolas"/>
+                <w:b w:val="0"/>
+                <w:i w:val="0"/>
+                <w:sz w:val="16"/>
+              </w:rPr>
+              <w:t>ChatInterface</w:t>
+            </w:r>
+            <w:r>
+              <w:rPr>
+                <w:rFonts w:ascii="Arial" w:hAnsi="Arial" w:cs="Arial" w:eastAsia="Arial"/>
+                <w:b w:val="0"/>
+                <w:i w:val="0"/>
+                <w:sz w:val="17"/>
+              </w:rPr>
+              <w:t>.</w:t>
+            </w:r>
+          </w:p>
+        </w:tc>
+      </w:tr>
+      <w:tr>
+        <w:trPr>
+          <w:cantSplit/>
+          <w:trHeight w:val="595"/>
+        </w:trPr>
+        <w:tc>
+          <w:tcPr>
+            <w:tcW w:w="1555" w:type="dxa"/>
+          </w:tcPr>
+          <w:p>
+            <w:pPr>
+              <w:spacing w:before="80" w:after="40"/>
+            </w:pPr>
+            <w:r>
+              <w:rPr>
+                <w:rFonts w:ascii="Arial" w:hAnsi="Arial" w:cs="Arial" w:eastAsia="Arial"/>
+                <w:b/>
+                <w:i w:val="0"/>
+                <w:sz w:val="19"/>
+              </w:rPr>
+              <w:t>Deliverable + checkpoint questions</w:t>
+            </w:r>
+          </w:p>
+          <w:p>
+            <w:pPr>
+              <w:spacing w:before="0" w:after="40"/>
+            </w:pPr>
+            <w:r>
+              <w:rPr>
+                <w:rFonts w:ascii="Arial" w:hAnsi="Arial" w:cs="Arial" w:eastAsia="Arial"/>
+                <w:b w:val="0"/>
+                <w:i/>
+                <w:sz w:val="17"/>
+              </w:rPr>
+              <w:t>Comparison table</w:t>
+            </w:r>
+          </w:p>
+        </w:tc>
+        <w:tc>
+          <w:tcPr>
+            <w:tcW w:w="4144" w:type="dxa"/>
+          </w:tcPr>
           <w:p>
             <w:pPr>
               <w:pStyle w:val="ListParagraph"/>
@@ -2522,214 +3097,7 @@
                 <w:i w:val="0"/>
                 <w:sz w:val="18"/>
               </w:rPr>
-              <w:t xml:space="preserve">Ran the sheet's sentiment prompt on the first 20 reviews with both models, with a </w:t>
-            </w:r>
-            <w:r>
-              <w:rPr>
-                <w:rFonts w:ascii="Consolas" w:hAnsi="Consolas" w:cs="Consolas" w:eastAsia="Consolas"/>
-                <w:b w:val="0"/>
-                <w:i w:val="0"/>
-                <w:sz w:val="17"/>
-              </w:rPr>
-              <w:t>time.time()</w:t>
-            </w:r>
-            <w:r>
-              <w:rPr>
-                <w:rFonts w:ascii="Arial" w:hAnsi="Arial" w:cs="Arial" w:eastAsia="Arial"/>
-                <w:b w:val="0"/>
-                <w:i w:val="0"/>
-                <w:sz w:val="18"/>
-              </w:rPr>
-              <w:t xml:space="preserve"> wrapper logging every single call.</w:t>
-            </w:r>
-          </w:p>
-          <w:p>
-            <w:pPr>
-              <w:pStyle w:val="ListParagraph"/>
-              <w:numPr>
-                <w:ilvl w:val="0"/>
-                <w:numId w:val="1"/>
-              </w:numPr>
-              <w:spacing w:before="0" w:after="60"/>
-            </w:pPr>
-            <w:r>
-              <w:rPr>
-                <w:rFonts w:ascii="Arial" w:hAnsi="Arial" w:cs="Arial" w:eastAsia="Arial"/>
-                <w:b w:val="0"/>
-                <w:i w:val="0"/>
-                <w:sz w:val="18"/>
-              </w:rPr>
-              <w:t xml:space="preserve">Local: </w:t>
-            </w:r>
-            <w:r>
-              <w:rPr>
-                <w:rFonts w:ascii="Arial" w:hAnsi="Arial" w:cs="Arial" w:eastAsia="Arial"/>
-                <w:b w:val="0"/>
-                <w:i w:val="0"/>
-                <w:sz w:val="18"/>
-                <w:highlight w:val="yellow"/>
-              </w:rPr>
-              <w:t>x.x</w:t>
-            </w:r>
-            <w:r>
-              <w:rPr>
-                <w:rFonts w:ascii="Arial" w:hAnsi="Arial" w:cs="Arial" w:eastAsia="Arial"/>
-                <w:b w:val="0"/>
-                <w:i w:val="0"/>
-                <w:sz w:val="18"/>
-              </w:rPr>
-              <w:t xml:space="preserve"> s per review on average, </w:t>
-            </w:r>
-            <w:r>
-              <w:rPr>
-                <w:rFonts w:ascii="Arial" w:hAnsi="Arial" w:cs="Arial" w:eastAsia="Arial"/>
-                <w:b/>
-                <w:i w:val="0"/>
-                <w:sz w:val="18"/>
-                <w:highlight w:val="yellow"/>
-              </w:rPr>
-              <w:t>x</w:t>
-            </w:r>
-            <w:r>
-              <w:rPr>
-                <w:rFonts w:ascii="Arial" w:hAnsi="Arial" w:cs="Arial" w:eastAsia="Arial"/>
-                <w:b/>
-                <w:i w:val="0"/>
-                <w:sz w:val="18"/>
-              </w:rPr>
-              <w:t>/20</w:t>
-            </w:r>
-            <w:r>
-              <w:rPr>
-                <w:rFonts w:ascii="Arial" w:hAnsi="Arial" w:cs="Arial" w:eastAsia="Arial"/>
-                <w:b w:val="0"/>
-                <w:i w:val="0"/>
-                <w:sz w:val="18"/>
-              </w:rPr>
-              <w:t xml:space="preserve"> right, </w:t>
-            </w:r>
-            <w:r>
-              <w:rPr>
-                <w:rFonts w:ascii="Arial" w:hAnsi="Arial" w:cs="Arial" w:eastAsia="Arial"/>
-                <w:b w:val="0"/>
-                <w:i w:val="0"/>
-                <w:sz w:val="18"/>
-                <w:highlight w:val="yellow"/>
-              </w:rPr>
-              <w:t>x</w:t>
-            </w:r>
-            <w:r>
-              <w:rPr>
-                <w:rFonts w:ascii="Arial" w:hAnsi="Arial" w:cs="Arial" w:eastAsia="Arial"/>
-                <w:b w:val="0"/>
-                <w:i w:val="0"/>
-                <w:sz w:val="18"/>
-              </w:rPr>
-              <w:t xml:space="preserve">/20 answered with one word. Cloud: </w:t>
-            </w:r>
-            <w:r>
-              <w:rPr>
-                <w:rFonts w:ascii="Arial" w:hAnsi="Arial" w:cs="Arial" w:eastAsia="Arial"/>
-                <w:b w:val="0"/>
-                <w:i w:val="0"/>
-                <w:sz w:val="18"/>
-                <w:highlight w:val="yellow"/>
-              </w:rPr>
-              <w:t>x.x</w:t>
-            </w:r>
-            <w:r>
-              <w:rPr>
-                <w:rFonts w:ascii="Arial" w:hAnsi="Arial" w:cs="Arial" w:eastAsia="Arial"/>
-                <w:b w:val="0"/>
-                <w:i w:val="0"/>
-                <w:sz w:val="18"/>
-              </w:rPr>
-              <w:t xml:space="preserve"> s, </w:t>
-            </w:r>
-            <w:r>
-              <w:rPr>
-                <w:rFonts w:ascii="Arial" w:hAnsi="Arial" w:cs="Arial" w:eastAsia="Arial"/>
-                <w:b/>
-                <w:i w:val="0"/>
-                <w:sz w:val="18"/>
-                <w:highlight w:val="yellow"/>
-              </w:rPr>
-              <w:t>x</w:t>
-            </w:r>
-            <w:r>
-              <w:rPr>
-                <w:rFonts w:ascii="Arial" w:hAnsi="Arial" w:cs="Arial" w:eastAsia="Arial"/>
-                <w:b/>
-                <w:i w:val="0"/>
-                <w:sz w:val="18"/>
-              </w:rPr>
-              <w:t>/20</w:t>
-            </w:r>
-            <w:r>
-              <w:rPr>
-                <w:rFonts w:ascii="Arial" w:hAnsi="Arial" w:cs="Arial" w:eastAsia="Arial"/>
-                <w:b w:val="0"/>
-                <w:i w:val="0"/>
-                <w:sz w:val="18"/>
-              </w:rPr>
-              <w:t xml:space="preserve"> right, </w:t>
-            </w:r>
-            <w:r>
-              <w:rPr>
-                <w:rFonts w:ascii="Arial" w:hAnsi="Arial" w:cs="Arial" w:eastAsia="Arial"/>
-                <w:b w:val="0"/>
-                <w:i w:val="0"/>
-                <w:sz w:val="18"/>
-                <w:highlight w:val="yellow"/>
-              </w:rPr>
-              <w:t>x</w:t>
-            </w:r>
-            <w:r>
-              <w:rPr>
-                <w:rFonts w:ascii="Arial" w:hAnsi="Arial" w:cs="Arial" w:eastAsia="Arial"/>
-                <w:b w:val="0"/>
-                <w:i w:val="0"/>
-                <w:sz w:val="18"/>
-              </w:rPr>
-              <w:t>/20 one word.</w:t>
-            </w:r>
-          </w:p>
-          <w:p>
-            <w:pPr>
-              <w:pStyle w:val="ListParagraph"/>
-              <w:numPr>
-                <w:ilvl w:val="0"/>
-                <w:numId w:val="1"/>
-              </w:numPr>
-              <w:spacing w:before="0" w:after="60"/>
-            </w:pPr>
-            <w:r>
-              <w:rPr>
-                <w:rFonts w:ascii="Arial" w:hAnsi="Arial" w:cs="Arial" w:eastAsia="Arial"/>
-                <w:b w:val="0"/>
-                <w:i w:val="0"/>
-                <w:sz w:val="18"/>
-              </w:rPr>
-              <w:t xml:space="preserve">The two models agreed on </w:t>
-            </w:r>
-            <w:r>
-              <w:rPr>
-                <w:rFonts w:ascii="Arial" w:hAnsi="Arial" w:cs="Arial" w:eastAsia="Arial"/>
-                <w:b w:val="0"/>
-                <w:i w:val="0"/>
-                <w:sz w:val="18"/>
-                <w:highlight w:val="yellow"/>
-              </w:rPr>
-              <w:t>x</w:t>
-            </w:r>
-            <w:r>
-              <w:rPr>
-                <w:rFonts w:ascii="Arial" w:hAnsi="Arial" w:cs="Arial" w:eastAsia="Arial"/>
-                <w:b w:val="0"/>
-                <w:i w:val="0"/>
-                <w:sz w:val="18"/>
-              </w:rPr>
-              <w:t xml:space="preserve">/20 reviews (Fig 1.1). </w:t>
+              <w:t>Made the comparison table (latency, cost, output quality) from my own numbers and answered the two checkpoint questions – both are below the screenshots.</w:t>
             </w:r>
           </w:p>
         </w:tc>
@@ -2749,7 +3117,7 @@
                 <w:i w:val="0"/>
                 <w:sz w:val="19"/>
               </w:rPr>
-              <w:t>1 h</w:t>
+              <w:t>0.5 h</w:t>
             </w:r>
           </w:p>
         </w:tc>
@@ -2786,807 +3154,8 @@
                 <w:b w:val="0"/>
                 <w:i w:val="0"/>
                 <w:sz w:val="17"/>
-                <w:highlight w:val="yellow"/>
-              </w:rPr>
-              <w:t>which one was faster per review, and by how much</w:t>
-            </w:r>
-          </w:p>
-          <w:p>
-            <w:pPr>
-              <w:pStyle w:val="ListParagraph"/>
-              <w:numPr>
-                <w:ilvl w:val="0"/>
-                <w:numId w:val="1"/>
-              </w:numPr>
-              <w:spacing w:before="0" w:after="40"/>
-            </w:pPr>
-            <w:r>
-              <w:rPr>
-                <w:rFonts w:ascii="Arial" w:hAnsi="Arial" w:cs="Arial" w:eastAsia="Arial"/>
-                <w:b w:val="0"/>
-                <w:i w:val="0"/>
-                <w:sz w:val="17"/>
-              </w:rPr>
-              <w:t>A wrapper (decorator) is an easy way to time every call without touching the function itself.</w:t>
-            </w:r>
-          </w:p>
-          <w:p>
-            <w:pPr>
-              <w:spacing w:before="80" w:after="20"/>
-            </w:pPr>
-            <w:r>
-              <w:rPr>
-                <w:rFonts w:ascii="Arial" w:hAnsi="Arial" w:cs="Arial" w:eastAsia="Arial"/>
-                <w:b/>
-                <w:i w:val="0"/>
-                <w:sz w:val="19"/>
-              </w:rPr>
-              <w:t>Problems:</w:t>
-            </w:r>
-          </w:p>
-          <w:p>
-            <w:pPr>
-              <w:pStyle w:val="ListParagraph"/>
-              <w:numPr>
-                <w:ilvl w:val="0"/>
-                <w:numId w:val="1"/>
-              </w:numPr>
-              <w:spacing w:before="0" w:after="40"/>
-            </w:pPr>
-            <w:r>
-              <w:rPr>
-                <w:rFonts w:ascii="Arial" w:hAnsi="Arial" w:cs="Arial" w:eastAsia="Arial"/>
-                <w:b w:val="0"/>
-                <w:i w:val="0"/>
-                <w:sz w:val="17"/>
-              </w:rPr>
-              <w:t xml:space="preserve">The sheet's code uses </w:t>
-            </w:r>
-            <w:r>
-              <w:rPr>
-                <w:rFonts w:ascii="Consolas" w:hAnsi="Consolas" w:cs="Consolas" w:eastAsia="Consolas"/>
-                <w:b w:val="0"/>
-                <w:i w:val="0"/>
-                <w:sz w:val="16"/>
-              </w:rPr>
-              <w:t>df['text']</w:t>
-            </w:r>
-            <w:r>
-              <w:rPr>
-                <w:rFonts w:ascii="Arial" w:hAnsi="Arial" w:cs="Arial" w:eastAsia="Arial"/>
-                <w:b w:val="0"/>
-                <w:i w:val="0"/>
-                <w:sz w:val="17"/>
-              </w:rPr>
-              <w:t xml:space="preserve"> but the column is called </w:t>
-            </w:r>
-            <w:r>
-              <w:rPr>
-                <w:rFonts w:ascii="Consolas" w:hAnsi="Consolas" w:cs="Consolas" w:eastAsia="Consolas"/>
-                <w:b w:val="0"/>
-                <w:i w:val="0"/>
-                <w:sz w:val="16"/>
-              </w:rPr>
-              <w:t>Text</w:t>
-            </w:r>
-            <w:r>
-              <w:rPr>
-                <w:rFonts w:ascii="Arial" w:hAnsi="Arial" w:cs="Arial" w:eastAsia="Arial"/>
-                <w:b w:val="0"/>
-                <w:i w:val="0"/>
-                <w:sz w:val="17"/>
-              </w:rPr>
-              <w:t xml:space="preserve"> → </w:t>
-            </w:r>
-            <w:r>
-              <w:rPr>
-                <w:rFonts w:ascii="Consolas" w:hAnsi="Consolas" w:cs="Consolas" w:eastAsia="Consolas"/>
-                <w:b w:val="0"/>
-                <w:i w:val="0"/>
-                <w:sz w:val="16"/>
-              </w:rPr>
-              <w:t>KeyError: 'text'</w:t>
-            </w:r>
-            <w:r>
-              <w:rPr>
-                <w:rFonts w:ascii="Arial" w:hAnsi="Arial" w:cs="Arial" w:eastAsia="Arial"/>
-                <w:b w:val="0"/>
-                <w:i w:val="0"/>
-                <w:sz w:val="17"/>
-              </w:rPr>
-              <w:t>. Renamed the columns after loading.</w:t>
-            </w:r>
-          </w:p>
-          <w:p>
-            <w:pPr>
-              <w:pStyle w:val="ListParagraph"/>
-              <w:numPr>
-                <w:ilvl w:val="0"/>
-                <w:numId w:val="1"/>
-              </w:numPr>
-              <w:spacing w:before="0" w:after="40"/>
-            </w:pPr>
-            <w:r>
-              <w:rPr>
-                <w:rFonts w:ascii="Arial" w:hAnsi="Arial" w:cs="Arial" w:eastAsia="Arial"/>
-                <w:b w:val="0"/>
-                <w:i w:val="0"/>
-                <w:sz w:val="17"/>
-              </w:rPr>
-              <w:t>Every review in the file is labelled 0 (negative), so I can only check how often each model says Negative – I'd need some positive reviews to test it properly.</w:t>
-            </w:r>
-          </w:p>
-          <w:p>
-            <w:pPr>
-              <w:pStyle w:val="ListParagraph"/>
-              <w:numPr>
-                <w:ilvl w:val="0"/>
-                <w:numId w:val="1"/>
-              </w:numPr>
-              <w:spacing w:before="0" w:after="40"/>
-            </w:pPr>
-            <w:r>
-              <w:rPr>
-                <w:rFonts w:ascii="Arial" w:hAnsi="Arial" w:cs="Arial" w:eastAsia="Arial"/>
-                <w:b w:val="0"/>
-                <w:i w:val="0"/>
-                <w:sz w:val="17"/>
-              </w:rPr>
-              <w:t>5 reviews have broken characters (e.g. 'clich√©' instead of 'cliché') from a bad text encoding – left them as they are.</w:t>
-            </w:r>
-          </w:p>
-        </w:tc>
-      </w:tr>
-      <w:tr>
-        <w:trPr>
-          <w:cantSplit/>
-          <w:trHeight w:val="595"/>
-        </w:trPr>
-        <w:tc>
-          <w:tcPr>
-            <w:tcW w:w="1555" w:type="dxa"/>
-          </w:tcPr>
-          <w:p>
-            <w:pPr>
-              <w:spacing w:before="80" w:after="40"/>
-            </w:pPr>
-            <w:r>
-              <w:rPr>
-                <w:rFonts w:ascii="Arial" w:hAnsi="Arial" w:cs="Arial" w:eastAsia="Arial"/>
-                <w:b/>
-                <w:i w:val="0"/>
-                <w:sz w:val="19"/>
-              </w:rPr>
-              <w:t>Think step by step vs direct</w:t>
-            </w:r>
-          </w:p>
-          <w:p>
-            <w:pPr>
-              <w:spacing w:before="0" w:after="40"/>
-            </w:pPr>
-            <w:r>
-              <w:rPr>
-                <w:rFonts w:ascii="Arial" w:hAnsi="Arial" w:cs="Arial" w:eastAsia="Arial"/>
-                <w:b w:val="0"/>
-                <w:i/>
-                <w:sz w:val="17"/>
-              </w:rPr>
-              <w:t>Step 8</w:t>
-            </w:r>
-          </w:p>
-        </w:tc>
-        <w:tc>
-          <w:tcPr>
-            <w:tcW w:w="4144" w:type="dxa"/>
-          </w:tcPr>
-          <w:p>
-            <w:pPr>
-              <w:pStyle w:val="ListParagraph"/>
-              <w:numPr>
-                <w:ilvl w:val="0"/>
-                <w:numId w:val="1"/>
-              </w:numPr>
-              <w:spacing w:before="0" w:after="60"/>
-            </w:pPr>
-            <w:r>
-              <w:rPr>
-                <w:rFonts w:ascii="Arial" w:hAnsi="Arial" w:cs="Arial" w:eastAsia="Arial"/>
-                <w:b w:val="0"/>
-                <w:i w:val="0"/>
-                <w:sz w:val="18"/>
-              </w:rPr>
-              <w:t xml:space="preserve">Asked the apple question (3 boxes of 12, 5 rotten → </w:t>
-            </w:r>
-            <w:r>
-              <w:rPr>
-                <w:rFonts w:ascii="Arial" w:hAnsi="Arial" w:cs="Arial" w:eastAsia="Arial"/>
-                <w:b/>
-                <w:i w:val="0"/>
-                <w:sz w:val="18"/>
-              </w:rPr>
-              <w:t>31</w:t>
-            </w:r>
-            <w:r>
-              <w:rPr>
-                <w:rFonts w:ascii="Arial" w:hAnsi="Arial" w:cs="Arial" w:eastAsia="Arial"/>
-                <w:b w:val="0"/>
-                <w:i w:val="0"/>
-                <w:sz w:val="18"/>
-              </w:rPr>
-              <w:t>) once with the sheet's 'think step by step' prompt and once with a direct 'final number only' prompt.</w:t>
-            </w:r>
-          </w:p>
-          <w:p>
-            <w:pPr>
-              <w:pStyle w:val="ListParagraph"/>
-              <w:numPr>
-                <w:ilvl w:val="0"/>
-                <w:numId w:val="1"/>
-              </w:numPr>
-              <w:spacing w:before="0" w:after="60"/>
-            </w:pPr>
-            <w:r>
-              <w:rPr>
-                <w:rFonts w:ascii="Arial" w:hAnsi="Arial" w:cs="Arial" w:eastAsia="Arial"/>
-                <w:b w:val="0"/>
-                <w:i w:val="0"/>
-                <w:sz w:val="18"/>
-              </w:rPr>
-              <w:t xml:space="preserve">Local model (3 tries each): step by step </w:t>
-            </w:r>
-            <w:r>
-              <w:rPr>
-                <w:rFonts w:ascii="Arial" w:hAnsi="Arial" w:cs="Arial" w:eastAsia="Arial"/>
-                <w:b w:val="0"/>
-                <w:i w:val="0"/>
-                <w:sz w:val="18"/>
-                <w:highlight w:val="yellow"/>
-              </w:rPr>
-              <w:t>x</w:t>
-            </w:r>
-            <w:r>
-              <w:rPr>
-                <w:rFonts w:ascii="Arial" w:hAnsi="Arial" w:cs="Arial" w:eastAsia="Arial"/>
-                <w:b w:val="0"/>
-                <w:i w:val="0"/>
-                <w:sz w:val="18"/>
-              </w:rPr>
-              <w:t xml:space="preserve">/3 right, direct </w:t>
-            </w:r>
-            <w:r>
-              <w:rPr>
-                <w:rFonts w:ascii="Arial" w:hAnsi="Arial" w:cs="Arial" w:eastAsia="Arial"/>
-                <w:b w:val="0"/>
-                <w:i w:val="0"/>
-                <w:sz w:val="18"/>
-                <w:highlight w:val="yellow"/>
-              </w:rPr>
-              <w:t>y</w:t>
-            </w:r>
-            <w:r>
-              <w:rPr>
-                <w:rFonts w:ascii="Arial" w:hAnsi="Arial" w:cs="Arial" w:eastAsia="Arial"/>
-                <w:b w:val="0"/>
-                <w:i w:val="0"/>
-                <w:sz w:val="18"/>
-              </w:rPr>
-              <w:t xml:space="preserve">/3. Gemini: step by step </w:t>
-            </w:r>
-            <w:r>
-              <w:rPr>
-                <w:rFonts w:ascii="Arial" w:hAnsi="Arial" w:cs="Arial" w:eastAsia="Arial"/>
-                <w:b w:val="0"/>
-                <w:i w:val="0"/>
-                <w:sz w:val="18"/>
-                <w:highlight w:val="yellow"/>
-              </w:rPr>
-              <w:t>x</w:t>
-            </w:r>
-            <w:r>
-              <w:rPr>
-                <w:rFonts w:ascii="Arial" w:hAnsi="Arial" w:cs="Arial" w:eastAsia="Arial"/>
-                <w:b w:val="0"/>
-                <w:i w:val="0"/>
-                <w:sz w:val="18"/>
-              </w:rPr>
-              <w:t xml:space="preserve">/1, direct </w:t>
-            </w:r>
-            <w:r>
-              <w:rPr>
-                <w:rFonts w:ascii="Arial" w:hAnsi="Arial" w:cs="Arial" w:eastAsia="Arial"/>
-                <w:b w:val="0"/>
-                <w:i w:val="0"/>
-                <w:sz w:val="18"/>
-                <w:highlight w:val="yellow"/>
-              </w:rPr>
-              <w:t>y</w:t>
-            </w:r>
-            <w:r>
-              <w:rPr>
-                <w:rFonts w:ascii="Arial" w:hAnsi="Arial" w:cs="Arial" w:eastAsia="Arial"/>
-                <w:b w:val="0"/>
-                <w:i w:val="0"/>
-                <w:sz w:val="18"/>
-              </w:rPr>
-              <w:t>/1.</w:t>
-            </w:r>
-          </w:p>
-        </w:tc>
-        <w:tc>
-          <w:tcPr>
-            <w:tcW w:w="883" w:type="dxa"/>
-          </w:tcPr>
-          <w:p>
-            <w:pPr>
-              <w:spacing w:before="80" w:after="40"/>
-              <w:jc w:val="center"/>
-            </w:pPr>
-            <w:r>
-              <w:rPr>
-                <w:rFonts w:ascii="Arial" w:hAnsi="Arial" w:cs="Arial" w:eastAsia="Arial"/>
-                <w:b/>
-                <w:i w:val="0"/>
-                <w:sz w:val="19"/>
-              </w:rPr>
-              <w:t>0.5 h</w:t>
-            </w:r>
-          </w:p>
-        </w:tc>
-        <w:tc>
-          <w:tcPr>
-            <w:tcW w:w="2383" w:type="dxa"/>
-          </w:tcPr>
-          <w:p>
-            <w:pPr>
-              <w:spacing w:before="80" w:after="20"/>
-            </w:pPr>
-            <w:r>
-              <w:rPr>
-                <w:rFonts w:ascii="Arial" w:hAnsi="Arial" w:cs="Arial" w:eastAsia="Arial"/>
-                <w:b/>
-                <w:i w:val="0"/>
-                <w:sz w:val="19"/>
-              </w:rPr>
-              <w:t>Learning:</w:t>
-            </w:r>
-          </w:p>
-          <w:p>
-            <w:pPr>
-              <w:pStyle w:val="ListParagraph"/>
-              <w:numPr>
-                <w:ilvl w:val="0"/>
-                <w:numId w:val="1"/>
-              </w:numPr>
-              <w:spacing w:before="0" w:after="40"/>
-            </w:pPr>
-            <w:r>
-              <w:rPr>
-                <w:rFonts w:ascii="Arial" w:hAnsi="Arial" w:cs="Arial" w:eastAsia="Arial"/>
-                <w:b w:val="0"/>
-                <w:i w:val="0"/>
-                <w:sz w:val="17"/>
-                <w:highlight w:val="yellow"/>
-              </w:rPr>
-              <w:t>did 'think step by step' help the small model? (see the summary table in step 8)</w:t>
-            </w:r>
-          </w:p>
-          <w:p>
-            <w:pPr>
-              <w:pStyle w:val="ListParagraph"/>
-              <w:numPr>
-                <w:ilvl w:val="0"/>
-                <w:numId w:val="1"/>
-              </w:numPr>
-              <w:spacing w:before="0" w:after="40"/>
-            </w:pPr>
-            <w:r>
-              <w:rPr>
-                <w:rFonts w:ascii="Arial" w:hAnsi="Arial" w:cs="Arial" w:eastAsia="Arial"/>
-                <w:b w:val="0"/>
-                <w:i w:val="0"/>
-                <w:sz w:val="17"/>
-              </w:rPr>
-              <w:t>Step-by-step answers are longer, so they take longer and cost more tokens on a paid plan.</w:t>
-            </w:r>
-          </w:p>
-          <w:p>
-            <w:pPr>
-              <w:spacing w:before="80" w:after="20"/>
-            </w:pPr>
-            <w:r>
-              <w:rPr>
-                <w:rFonts w:ascii="Arial" w:hAnsi="Arial" w:cs="Arial" w:eastAsia="Arial"/>
-                <w:b/>
-                <w:i w:val="0"/>
-                <w:sz w:val="19"/>
-              </w:rPr>
-              <w:t>Problems:</w:t>
-            </w:r>
-          </w:p>
-          <w:p>
-            <w:pPr>
-              <w:pStyle w:val="ListParagraph"/>
-              <w:numPr>
-                <w:ilvl w:val="0"/>
-                <w:numId w:val="1"/>
-              </w:numPr>
-              <w:spacing w:before="0" w:after="40"/>
-            </w:pPr>
-            <w:r>
-              <w:rPr>
-                <w:rFonts w:ascii="Arial" w:hAnsi="Arial" w:cs="Arial" w:eastAsia="Arial"/>
-                <w:b w:val="0"/>
-                <w:i w:val="0"/>
-                <w:sz w:val="17"/>
-              </w:rPr>
-              <w:t>None really for this one.</w:t>
-            </w:r>
-          </w:p>
-        </w:tc>
-      </w:tr>
-      <w:tr>
-        <w:trPr>
-          <w:cantSplit/>
-          <w:trHeight w:val="595"/>
-        </w:trPr>
-        <w:tc>
-          <w:tcPr>
-            <w:tcW w:w="1555" w:type="dxa"/>
-          </w:tcPr>
-          <w:p>
-            <w:pPr>
-              <w:spacing w:before="80" w:after="40"/>
-            </w:pPr>
-            <w:r>
-              <w:rPr>
-                <w:rFonts w:ascii="Arial" w:hAnsi="Arial" w:cs="Arial" w:eastAsia="Arial"/>
-                <w:b/>
-                <w:i w:val="0"/>
-                <w:sz w:val="19"/>
-              </w:rPr>
-              <w:t>Chat demo with Gradio</w:t>
-            </w:r>
-          </w:p>
-          <w:p>
-            <w:pPr>
-              <w:spacing w:before="0" w:after="40"/>
-            </w:pPr>
-            <w:r>
-              <w:rPr>
-                <w:rFonts w:ascii="Arial" w:hAnsi="Arial" w:cs="Arial" w:eastAsia="Arial"/>
-                <w:b w:val="0"/>
-                <w:i/>
-                <w:sz w:val="17"/>
-              </w:rPr>
-              <w:t>Step 9</w:t>
-            </w:r>
-          </w:p>
-        </w:tc>
-        <w:tc>
-          <w:tcPr>
-            <w:tcW w:w="4144" w:type="dxa"/>
-          </w:tcPr>
-          <w:p>
-            <w:pPr>
-              <w:pStyle w:val="ListParagraph"/>
-              <w:numPr>
-                <w:ilvl w:val="0"/>
-                <w:numId w:val="1"/>
-              </w:numPr>
-              <w:spacing w:before="0" w:after="60"/>
-            </w:pPr>
-            <w:r>
-              <w:rPr>
-                <w:rFonts w:ascii="Arial" w:hAnsi="Arial" w:cs="Arial" w:eastAsia="Arial"/>
-                <w:b w:val="0"/>
-                <w:i w:val="0"/>
-                <w:sz w:val="18"/>
-              </w:rPr>
-              <w:t xml:space="preserve">Made a chat window with Gradio's </w:t>
-            </w:r>
-            <w:r>
-              <w:rPr>
-                <w:rFonts w:ascii="Consolas" w:hAnsi="Consolas" w:cs="Consolas" w:eastAsia="Consolas"/>
-                <w:b w:val="0"/>
-                <w:i w:val="0"/>
-                <w:sz w:val="17"/>
-              </w:rPr>
-              <w:t>ChatInterface</w:t>
-            </w:r>
-            <w:r>
-              <w:rPr>
-                <w:rFonts w:ascii="Arial" w:hAnsi="Arial" w:cs="Arial" w:eastAsia="Arial"/>
-                <w:b w:val="0"/>
-                <w:i w:val="0"/>
-                <w:sz w:val="18"/>
-              </w:rPr>
-              <w:t xml:space="preserve"> and a switch to pick the local or the cloud model. Every answer shows which model replied and how long it took.</w:t>
-            </w:r>
-          </w:p>
-          <w:p>
-            <w:pPr>
-              <w:pStyle w:val="ListParagraph"/>
-              <w:numPr>
-                <w:ilvl w:val="0"/>
-                <w:numId w:val="1"/>
-              </w:numPr>
-              <w:spacing w:before="0" w:after="60"/>
-            </w:pPr>
-            <w:r>
-              <w:rPr>
-                <w:rFonts w:ascii="Arial" w:hAnsi="Arial" w:cs="Arial" w:eastAsia="Arial"/>
-                <w:b w:val="0"/>
-                <w:i w:val="0"/>
-                <w:sz w:val="18"/>
-              </w:rPr>
-              <w:t>It sends the whole conversation each time, so the model remembers what I said before.</w:t>
-            </w:r>
-          </w:p>
-        </w:tc>
-        <w:tc>
-          <w:tcPr>
-            <w:tcW w:w="883" w:type="dxa"/>
-          </w:tcPr>
-          <w:p>
-            <w:pPr>
-              <w:spacing w:before="80" w:after="40"/>
-              <w:jc w:val="center"/>
-            </w:pPr>
-            <w:r>
-              <w:rPr>
-                <w:rFonts w:ascii="Arial" w:hAnsi="Arial" w:cs="Arial" w:eastAsia="Arial"/>
-                <w:b/>
-                <w:i w:val="0"/>
-                <w:sz w:val="19"/>
-              </w:rPr>
-              <w:t>0.5 h</w:t>
-            </w:r>
-          </w:p>
-        </w:tc>
-        <w:tc>
-          <w:tcPr>
-            <w:tcW w:w="2383" w:type="dxa"/>
-          </w:tcPr>
-          <w:p>
-            <w:pPr>
-              <w:spacing w:before="80" w:after="20"/>
-            </w:pPr>
-            <w:r>
-              <w:rPr>
-                <w:rFonts w:ascii="Arial" w:hAnsi="Arial" w:cs="Arial" w:eastAsia="Arial"/>
-                <w:b/>
-                <w:i w:val="0"/>
-                <w:sz w:val="19"/>
-              </w:rPr>
-              <w:t>Learning:</w:t>
-            </w:r>
-          </w:p>
-          <w:p>
-            <w:pPr>
-              <w:pStyle w:val="ListParagraph"/>
-              <w:numPr>
-                <w:ilvl w:val="0"/>
-                <w:numId w:val="1"/>
-              </w:numPr>
-              <w:spacing w:before="0" w:after="40"/>
-            </w:pPr>
-            <w:r>
-              <w:rPr>
-                <w:rFonts w:ascii="Arial" w:hAnsi="Arial" w:cs="Arial" w:eastAsia="Arial"/>
-                <w:b w:val="0"/>
-                <w:i w:val="0"/>
-                <w:sz w:val="17"/>
-              </w:rPr>
-              <w:t>Gradio turns a normal Python function into a web page in a few lines.</w:t>
-            </w:r>
-          </w:p>
-          <w:p>
-            <w:pPr>
-              <w:pStyle w:val="ListParagraph"/>
-              <w:numPr>
-                <w:ilvl w:val="0"/>
-                <w:numId w:val="1"/>
-              </w:numPr>
-              <w:spacing w:before="0" w:after="40"/>
-            </w:pPr>
-            <w:r>
-              <w:rPr>
-                <w:rFonts w:ascii="Arial" w:hAnsi="Arial" w:cs="Arial" w:eastAsia="Arial"/>
-                <w:b w:val="0"/>
-                <w:i w:val="0"/>
-                <w:sz w:val="17"/>
-              </w:rPr>
-              <w:t>The model itself doesn't remember anything – the 'memory' is just my code sending the old messages again.</w:t>
-            </w:r>
-          </w:p>
-          <w:p>
-            <w:pPr>
-              <w:spacing w:before="80" w:after="20"/>
-            </w:pPr>
-            <w:r>
-              <w:rPr>
-                <w:rFonts w:ascii="Arial" w:hAnsi="Arial" w:cs="Arial" w:eastAsia="Arial"/>
-                <w:b/>
-                <w:i w:val="0"/>
-                <w:sz w:val="19"/>
-              </w:rPr>
-              <w:t>Problems:</w:t>
-            </w:r>
-          </w:p>
-          <w:p>
-            <w:pPr>
-              <w:pStyle w:val="ListParagraph"/>
-              <w:numPr>
-                <w:ilvl w:val="0"/>
-                <w:numId w:val="1"/>
-              </w:numPr>
-              <w:spacing w:before="0" w:after="40"/>
-            </w:pPr>
-            <w:r>
-              <w:rPr>
-                <w:rFonts w:ascii="Arial" w:hAnsi="Arial" w:cs="Arial" w:eastAsia="Arial"/>
-                <w:b w:val="0"/>
-                <w:i w:val="0"/>
-                <w:sz w:val="17"/>
-              </w:rPr>
-              <w:t xml:space="preserve">The sheet says </w:t>
-            </w:r>
-            <w:r>
-              <w:rPr>
-                <w:rFonts w:ascii="Consolas" w:hAnsi="Consolas" w:cs="Consolas" w:eastAsia="Consolas"/>
-                <w:b w:val="0"/>
-                <w:i w:val="0"/>
-                <w:sz w:val="16"/>
-              </w:rPr>
-              <w:t>GradioUI</w:t>
-            </w:r>
-            <w:r>
-              <w:rPr>
-                <w:rFonts w:ascii="Arial" w:hAnsi="Arial" w:cs="Arial" w:eastAsia="Arial"/>
-                <w:b w:val="0"/>
-                <w:i w:val="0"/>
-                <w:sz w:val="17"/>
-              </w:rPr>
-              <w:t xml:space="preserve">, but that's from smolagents (next week) and there's no agent yet, so I used Gradio's own </w:t>
-            </w:r>
-            <w:r>
-              <w:rPr>
-                <w:rFonts w:ascii="Consolas" w:hAnsi="Consolas" w:cs="Consolas" w:eastAsia="Consolas"/>
-                <w:b w:val="0"/>
-                <w:i w:val="0"/>
-                <w:sz w:val="16"/>
-              </w:rPr>
-              <w:t>ChatInterface</w:t>
-            </w:r>
-            <w:r>
-              <w:rPr>
-                <w:rFonts w:ascii="Arial" w:hAnsi="Arial" w:cs="Arial" w:eastAsia="Arial"/>
-                <w:b w:val="0"/>
-                <w:i w:val="0"/>
-                <w:sz w:val="17"/>
-              </w:rPr>
-              <w:t>.</w:t>
-            </w:r>
-          </w:p>
-        </w:tc>
-      </w:tr>
-      <w:tr>
-        <w:trPr>
-          <w:cantSplit/>
-          <w:trHeight w:val="595"/>
-        </w:trPr>
-        <w:tc>
-          <w:tcPr>
-            <w:tcW w:w="1555" w:type="dxa"/>
-          </w:tcPr>
-          <w:p>
-            <w:pPr>
-              <w:spacing w:before="80" w:after="40"/>
-            </w:pPr>
-            <w:r>
-              <w:rPr>
-                <w:rFonts w:ascii="Arial" w:hAnsi="Arial" w:cs="Arial" w:eastAsia="Arial"/>
-                <w:b/>
-                <w:i w:val="0"/>
-                <w:sz w:val="19"/>
-              </w:rPr>
-              <w:t>Deliverable + checkpoint questions</w:t>
-            </w:r>
-          </w:p>
-          <w:p>
-            <w:pPr>
-              <w:spacing w:before="0" w:after="40"/>
-            </w:pPr>
-            <w:r>
-              <w:rPr>
-                <w:rFonts w:ascii="Arial" w:hAnsi="Arial" w:cs="Arial" w:eastAsia="Arial"/>
-                <w:b w:val="0"/>
-                <w:i/>
-                <w:sz w:val="17"/>
-              </w:rPr>
-              <w:t>Comparison table</w:t>
-            </w:r>
-          </w:p>
-        </w:tc>
-        <w:tc>
-          <w:tcPr>
-            <w:tcW w:w="4144" w:type="dxa"/>
-          </w:tcPr>
-          <w:p>
-            <w:pPr>
-              <w:pStyle w:val="ListParagraph"/>
-              <w:numPr>
-                <w:ilvl w:val="0"/>
-                <w:numId w:val="1"/>
-              </w:numPr>
-              <w:spacing w:before="0" w:after="60"/>
-            </w:pPr>
-            <w:r>
-              <w:rPr>
-                <w:rFonts w:ascii="Arial" w:hAnsi="Arial" w:cs="Arial" w:eastAsia="Arial"/>
-                <w:b w:val="0"/>
-                <w:i w:val="0"/>
-                <w:sz w:val="18"/>
-              </w:rPr>
-              <w:t>Comparison table (latency, cost, output quality) made from my own numbers, and answered the two checkpoint questions – both are below the screenshots.</w:t>
-            </w:r>
-          </w:p>
-        </w:tc>
-        <w:tc>
-          <w:tcPr>
-            <w:tcW w:w="883" w:type="dxa"/>
-          </w:tcPr>
-          <w:p>
-            <w:pPr>
-              <w:spacing w:before="80" w:after="40"/>
-              <w:jc w:val="center"/>
-            </w:pPr>
-            <w:r>
-              <w:rPr>
-                <w:rFonts w:ascii="Arial" w:hAnsi="Arial" w:cs="Arial" w:eastAsia="Arial"/>
-                <w:b/>
-                <w:i w:val="0"/>
-                <w:sz w:val="19"/>
-              </w:rPr>
-              <w:t>0.5 h</w:t>
-            </w:r>
-          </w:p>
-        </w:tc>
-        <w:tc>
-          <w:tcPr>
-            <w:tcW w:w="2383" w:type="dxa"/>
-          </w:tcPr>
-          <w:p>
-            <w:pPr>
-              <w:spacing w:before="80" w:after="20"/>
-            </w:pPr>
-            <w:r>
-              <w:rPr>
-                <w:rFonts w:ascii="Arial" w:hAnsi="Arial" w:cs="Arial" w:eastAsia="Arial"/>
-                <w:b/>
-                <w:i w:val="0"/>
-                <w:sz w:val="19"/>
-              </w:rPr>
-              <w:t>Learning:</w:t>
-            </w:r>
-          </w:p>
-          <w:p>
-            <w:pPr>
-              <w:pStyle w:val="ListParagraph"/>
-              <w:numPr>
-                <w:ilvl w:val="0"/>
-                <w:numId w:val="1"/>
-              </w:numPr>
-              <w:spacing w:before="0" w:after="40"/>
-            </w:pPr>
-            <w:r>
-              <w:rPr>
-                <w:rFonts w:ascii="Arial" w:hAnsi="Arial" w:cs="Arial" w:eastAsia="Arial"/>
-                <w:b w:val="0"/>
-                <w:i w:val="0"/>
-                <w:sz w:val="17"/>
-              </w:rPr>
-              <w:t>Local wins on cost and privacy, cloud wins on quality and how easy it is to use a big model.</w:t>
+              </w:rPr>
+              <w:t>Local wins on cost, privacy and (here) speed; cloud wins on quality.</w:t>
             </w:r>
           </w:p>
           <w:p>
@@ -3741,7 +3310,81 @@
           <w:i/>
           <w:sz w:val="18"/>
         </w:rPr>
-        <w:t>Figure 1.1 comes straight out of my notebook. The yellow boxes are screenshots I still need to add.</w:t>
+        <w:t xml:space="preserve">Figure 1.1 is made from the latencies my notebook printed. The yellow boxes are screenshots I still need to add (take them from </w:t>
+      </w:r>
+      <w:r>
+        <w:rPr>
+          <w:rFonts w:ascii="Consolas" w:hAnsi="Consolas" w:cs="Consolas" w:eastAsia="Consolas"/>
+          <w:b w:val="0"/>
+          <w:i/>
+          <w:sz w:val="17"/>
+        </w:rPr>
+        <w:t>Lab1_completed.ipynb</w:t>
+      </w:r>
+      <w:r>
+        <w:rPr>
+          <w:rFonts w:ascii="Arial" w:hAnsi="Arial" w:cs="Arial" w:eastAsia="Arial"/>
+          <w:b w:val="0"/>
+          <w:i/>
+          <w:sz w:val="18"/>
+        </w:rPr>
+        <w:t xml:space="preserve"> – the copy without the API key).</w:t>
+      </w:r>
+    </w:p>
+    <w:p>
+      <w:pPr>
+        <w:keepNext/>
+        <w:spacing w:before="120" w:after="40"/>
+        <w:jc w:val="center"/>
+      </w:pPr>
+      <w:r>
+        <w:drawing>
+          <wp:inline xmlns:a="http://schemas.openxmlformats.org/drawingml/2006/main" xmlns:pic="http://schemas.openxmlformats.org/drawingml/2006/picture">
+            <wp:extent cx="5303520" cy="2817495"/>
+            <wp:docPr id="1" name="Picture 1"/>
+            <wp:cNvGraphicFramePr>
+              <a:graphicFrameLocks noChangeAspect="1"/>
+            </wp:cNvGraphicFramePr>
+            <a:graphic>
+              <a:graphicData uri="http://schemas.openxmlformats.org/drawingml/2006/picture">
+                <pic:pic>
+                  <pic:nvPicPr>
+                    <pic:cNvPr id="0" name="1_1_latency.png"/>
+                    <pic:cNvPicPr/>
+                  </pic:nvPicPr>
+                  <pic:blipFill>
+                    <a:blip r:embed="rId15"/>
+                    <a:stretch>
+                      <a:fillRect/>
+                    </a:stretch>
+                  </pic:blipFill>
+                  <pic:spPr>
+                    <a:xfrm>
+                      <a:off x="0" y="0"/>
+                      <a:ext cx="5303520" cy="2817495"/>
+                    </a:xfrm>
+                    <a:prstGeom prst="rect"/>
+                  </pic:spPr>
+                </pic:pic>
+              </a:graphicData>
+            </a:graphic>
+          </wp:inline>
+        </w:drawing>
+      </w:r>
+    </w:p>
+    <w:p>
+      <w:pPr>
+        <w:spacing w:before="0" w:after="160"/>
+        <w:jc w:val="center"/>
+      </w:pPr>
+      <w:r>
+        <w:rPr>
+          <w:rFonts w:ascii="Arial" w:hAnsi="Arial" w:cs="Arial" w:eastAsia="Arial"/>
+          <w:b w:val="0"/>
+          <w:i/>
+          <w:sz w:val="17"/>
+        </w:rPr>
+        <w:t>Figure 1.1 – latency per call for each task, local vs cloud (from my time.time() wrapper)</w:t>
       </w:r>
     </w:p>
     <w:tbl>
@@ -3790,7 +3433,7 @@
                 <w:i w:val="0"/>
                 <w:sz w:val="19"/>
               </w:rPr>
-              <w:t>Terminal – `ollama run llama3.2:1b`</w:t>
+              <w:t>Terminal – ollama run llama3.2:1b</w:t>
             </w:r>
           </w:p>
           <w:p>
@@ -3823,7 +3466,7 @@
                 <w:i w:val="0"/>
                 <w:sz w:val="17"/>
               </w:rPr>
-              <w:t xml:space="preserve">: the 'pulling … success' lines and the model's reply after you type </w:t>
+              <w:t xml:space="preserve"> and the model's reply when you type </w:t>
             </w:r>
             <w:r>
               <w:rPr>
@@ -3841,7 +3484,25 @@
                 <w:i w:val="0"/>
                 <w:sz w:val="17"/>
               </w:rPr>
-              <w:t>.</w:t>
+              <w:t xml:space="preserve"> (</w:t>
+            </w:r>
+            <w:r>
+              <w:rPr>
+                <w:rFonts w:ascii="Consolas" w:hAnsi="Consolas" w:cs="Consolas" w:eastAsia="Consolas"/>
+                <w:b w:val="0"/>
+                <w:i w:val="0"/>
+                <w:sz w:val="16"/>
+              </w:rPr>
+              <w:t>/bye</w:t>
+            </w:r>
+            <w:r>
+              <w:rPr>
+                <w:rFonts w:ascii="Arial" w:hAnsi="Arial" w:cs="Arial" w:eastAsia="Arial"/>
+                <w:b w:val="0"/>
+                <w:i w:val="0"/>
+                <w:sz w:val="17"/>
+              </w:rPr>
+              <w:t xml:space="preserve"> to quit).</w:t>
             </w:r>
           </w:p>
           <w:p>
@@ -3910,16 +3571,7 @@
           <w:i/>
           <w:sz w:val="17"/>
         </w:rPr>
-        <w:t xml:space="preserve">Screenshot 1.1 – Terminal – </w:t>
-      </w:r>
-      <w:r>
-        <w:rPr>
-          <w:rFonts w:ascii="Consolas" w:hAnsi="Consolas" w:cs="Consolas" w:eastAsia="Consolas"/>
-          <w:b w:val="0"/>
-          <w:i/>
-          <w:sz w:val="16"/>
-        </w:rPr>
-        <w:t>ollama run llama3.2:1b</w:t>
+        <w:t>Screenshot 1.1 – Terminal – ollama run llama3.2:1b</w:t>
       </w:r>
     </w:p>
     <w:tbl>
@@ -3968,7 +3620,7 @@
                 <w:i w:val="0"/>
                 <w:sz w:val="19"/>
               </w:rPr>
-              <w:t>Notebook – local model + under the hood</w:t>
+              <w:t>Notebook – local model</w:t>
             </w:r>
           </w:p>
           <w:p>
@@ -3983,7 +3635,7 @@
                 <w:i w:val="0"/>
                 <w:sz w:val="17"/>
               </w:rPr>
-              <w:t>What to capture: the step 3 cell (</w:t>
+              <w:t xml:space="preserve">What to capture: the </w:t>
             </w:r>
             <w:r>
               <w:rPr>
@@ -3992,16 +3644,16 @@
                 <w:i w:val="0"/>
                 <w:sz w:val="16"/>
               </w:rPr>
-              <w:t>ollama.chat</w:t>
-            </w:r>
-            <w:r>
-              <w:rPr>
-                <w:rFonts w:ascii="Arial" w:hAnsi="Arial" w:cs="Arial" w:eastAsia="Arial"/>
-                <w:b w:val="0"/>
-                <w:i w:val="0"/>
-                <w:sz w:val="17"/>
-              </w:rPr>
-              <w:t xml:space="preserve">) with its answer and the '--- llama3.2:1b: … s' line, and the step 4 output (HTTP status 200, the JSON keys, 'loaded in memory'). Two shots are fine: </w:t>
+              <w:t>import ollama</w:t>
+            </w:r>
+            <w:r>
+              <w:rPr>
+                <w:rFonts w:ascii="Arial" w:hAnsi="Arial" w:cs="Arial" w:eastAsia="Arial"/>
+                <w:b w:val="0"/>
+                <w:i w:val="0"/>
+                <w:sz w:val="17"/>
+              </w:rPr>
+              <w:t xml:space="preserve"> + </w:t>
             </w:r>
             <w:r>
               <w:rPr>
@@ -4010,34 +3662,16 @@
                 <w:i w:val="0"/>
                 <w:sz w:val="16"/>
               </w:rPr>
-              <w:t>1.2a_…</w:t>
-            </w:r>
-            <w:r>
-              <w:rPr>
-                <w:rFonts w:ascii="Arial" w:hAnsi="Arial" w:cs="Arial" w:eastAsia="Arial"/>
-                <w:b w:val="0"/>
-                <w:i w:val="0"/>
-                <w:sz w:val="17"/>
-              </w:rPr>
-              <w:t xml:space="preserve"> + </w:t>
-            </w:r>
-            <w:r>
-              <w:rPr>
-                <w:rFonts w:ascii="Consolas" w:hAnsi="Consolas" w:cs="Consolas" w:eastAsia="Consolas"/>
-                <w:b w:val="0"/>
-                <w:i w:val="0"/>
-                <w:sz w:val="16"/>
-              </w:rPr>
-              <w:t>1.2b_…</w:t>
-            </w:r>
-            <w:r>
-              <w:rPr>
-                <w:rFonts w:ascii="Arial" w:hAnsi="Arial" w:cs="Arial" w:eastAsia="Arial"/>
-                <w:b w:val="0"/>
-                <w:i w:val="0"/>
-                <w:sz w:val="17"/>
-              </w:rPr>
-              <w:t>.</w:t>
+              <w:t>ollama.chat(...)</w:t>
+            </w:r>
+            <w:r>
+              <w:rPr>
+                <w:rFonts w:ascii="Arial" w:hAnsi="Arial" w:cs="Arial" w:eastAsia="Arial"/>
+                <w:b w:val="0"/>
+                <w:i w:val="0"/>
+                <w:sz w:val="17"/>
+              </w:rPr>
+              <w:t xml:space="preserve"> cells and the start of the answer to 'What is an intelligent system?'.</w:t>
             </w:r>
           </w:p>
           <w:p>
@@ -4106,7 +3740,7 @@
           <w:i/>
           <w:sz w:val="17"/>
         </w:rPr>
-        <w:t>Screenshot 1.2 – Notebook – local model + under the hood</w:t>
+        <w:t>Screenshot 1.2 – Notebook – local model</w:t>
       </w:r>
     </w:p>
     <w:tbl>
@@ -4170,7 +3804,7 @@
                 <w:i w:val="0"/>
                 <w:sz w:val="17"/>
               </w:rPr>
-              <w:t>What to capture: aistudio.google.com/app/api-keys with your key in the list (it only shows the last few characters – that's fine). Never screenshot the full key.</w:t>
+              <w:t>What to capture: aistudio.google.com/app/api-keys with your key in the list (it only shows the last few characters – that's fine). Never the full key.</w:t>
             </w:r>
           </w:p>
           <w:p>
@@ -4303,7 +3937,61 @@
                 <w:i w:val="0"/>
                 <w:sz w:val="17"/>
               </w:rPr>
-              <w:t>What to capture: the step 5 output: Gemini's answer, the '--- gemini… s | prompt … tokens' line and the 'Same question: local … vs cloud …' line.</w:t>
+              <w:t xml:space="preserve">What to capture: the </w:t>
+            </w:r>
+            <w:r>
+              <w:rPr>
+                <w:rFonts w:ascii="Consolas" w:hAnsi="Consolas" w:cs="Consolas" w:eastAsia="Consolas"/>
+                <w:b w:val="0"/>
+                <w:i w:val="0"/>
+                <w:sz w:val="16"/>
+              </w:rPr>
+              <w:t>genai.Client()</w:t>
+            </w:r>
+            <w:r>
+              <w:rPr>
+                <w:rFonts w:ascii="Arial" w:hAnsi="Arial" w:cs="Arial" w:eastAsia="Arial"/>
+                <w:b w:val="0"/>
+                <w:i w:val="0"/>
+                <w:sz w:val="17"/>
+              </w:rPr>
+              <w:t xml:space="preserve"> + </w:t>
+            </w:r>
+            <w:r>
+              <w:rPr>
+                <w:rFonts w:ascii="Consolas" w:hAnsi="Consolas" w:cs="Consolas" w:eastAsia="Consolas"/>
+                <w:b w:val="0"/>
+                <w:i w:val="0"/>
+                <w:sz w:val="16"/>
+              </w:rPr>
+              <w:t>generate_content</w:t>
+            </w:r>
+            <w:r>
+              <w:rPr>
+                <w:rFonts w:ascii="Arial" w:hAnsi="Arial" w:cs="Arial" w:eastAsia="Arial"/>
+                <w:b w:val="0"/>
+                <w:i w:val="0"/>
+                <w:sz w:val="17"/>
+              </w:rPr>
+              <w:t xml:space="preserve"> cells and the start of Gemini's answer – from </w:t>
+            </w:r>
+            <w:r>
+              <w:rPr>
+                <w:rFonts w:ascii="Consolas" w:hAnsi="Consolas" w:cs="Consolas" w:eastAsia="Consolas"/>
+                <w:b w:val="0"/>
+                <w:i w:val="0"/>
+                <w:sz w:val="16"/>
+              </w:rPr>
+              <w:t>Lab1_completed.ipynb</w:t>
+            </w:r>
+            <w:r>
+              <w:rPr>
+                <w:rFonts w:ascii="Arial" w:hAnsi="Arial" w:cs="Arial" w:eastAsia="Arial"/>
+                <w:b w:val="0"/>
+                <w:i w:val="0"/>
+                <w:sz w:val="17"/>
+              </w:rPr>
+              <w:t>, so no key is visible.</w:t>
             </w:r>
           </w:p>
           <w:p>
@@ -4421,7 +4109,7 @@
                 <w:i w:val="0"/>
                 <w:sz w:val="19"/>
               </w:rPr>
-              <w:t>Notebook – sentiment on both models</w:t>
+              <w:t>Notebook – counting on both models</w:t>
             </w:r>
           </w:p>
           <w:p>
@@ -4436,7 +4124,43 @@
                 <w:i w:val="0"/>
                 <w:sz w:val="17"/>
               </w:rPr>
-              <w:t>What to capture: the step 7 results table (avg seconds, correct, one-word answers, predictions) and the 'agreed on …' lines under it.</w:t>
+              <w:t xml:space="preserve">What to capture: the two counting functions' 'Latency: 1.32s' / 'Latency: 3.18s' lines and both answers. Two shots are fine: </w:t>
+            </w:r>
+            <w:r>
+              <w:rPr>
+                <w:rFonts w:ascii="Consolas" w:hAnsi="Consolas" w:cs="Consolas" w:eastAsia="Consolas"/>
+                <w:b w:val="0"/>
+                <w:i w:val="0"/>
+                <w:sz w:val="16"/>
+              </w:rPr>
+              <w:t>1.5a_…</w:t>
+            </w:r>
+            <w:r>
+              <w:rPr>
+                <w:rFonts w:ascii="Arial" w:hAnsi="Arial" w:cs="Arial" w:eastAsia="Arial"/>
+                <w:b w:val="0"/>
+                <w:i w:val="0"/>
+                <w:sz w:val="17"/>
+              </w:rPr>
+              <w:t xml:space="preserve"> + </w:t>
+            </w:r>
+            <w:r>
+              <w:rPr>
+                <w:rFonts w:ascii="Consolas" w:hAnsi="Consolas" w:cs="Consolas" w:eastAsia="Consolas"/>
+                <w:b w:val="0"/>
+                <w:i w:val="0"/>
+                <w:sz w:val="16"/>
+              </w:rPr>
+              <w:t>1.5b_…</w:t>
+            </w:r>
+            <w:r>
+              <w:rPr>
+                <w:rFonts w:ascii="Arial" w:hAnsi="Arial" w:cs="Arial" w:eastAsia="Arial"/>
+                <w:b w:val="0"/>
+                <w:i w:val="0"/>
+                <w:sz w:val="17"/>
+              </w:rPr>
+              <w:t>.</w:t>
             </w:r>
           </w:p>
           <w:p>
@@ -4460,7 +4184,7 @@
                 <w:i/>
                 <w:sz w:val="15"/>
               </w:rPr>
-              <w:t>Lab 1/screenshots/1.5_sentiment_results.png</w:t>
+              <w:t>Lab 1/screenshots/1.5_count_both_models.png</w:t>
             </w:r>
             <w:r>
               <w:rPr>
@@ -4505,7 +4229,7 @@
           <w:i/>
           <w:sz w:val="17"/>
         </w:rPr>
-        <w:t>Screenshot 1.5 – Notebook – sentiment on both models</w:t>
+        <w:t>Screenshot 1.5 – Notebook – counting on both models</w:t>
       </w:r>
     </w:p>
     <w:tbl>
@@ -4569,7 +4293,43 @@
                 <w:i w:val="0"/>
                 <w:sz w:val="17"/>
               </w:rPr>
-              <w:t>What to capture: the bottom of the step 8 cell: one or two answers + the small summary table (right / avg seconds / avg words).</w:t>
+              <w:t xml:space="preserve">What to capture: the four apple cells with their 'Latency' lines and answers (Ollama + Gemini, reasoning + non-reasoning). Two shots are fine: </w:t>
+            </w:r>
+            <w:r>
+              <w:rPr>
+                <w:rFonts w:ascii="Consolas" w:hAnsi="Consolas" w:cs="Consolas" w:eastAsia="Consolas"/>
+                <w:b w:val="0"/>
+                <w:i w:val="0"/>
+                <w:sz w:val="16"/>
+              </w:rPr>
+              <w:t>1.6a_…</w:t>
+            </w:r>
+            <w:r>
+              <w:rPr>
+                <w:rFonts w:ascii="Arial" w:hAnsi="Arial" w:cs="Arial" w:eastAsia="Arial"/>
+                <w:b w:val="0"/>
+                <w:i w:val="0"/>
+                <w:sz w:val="17"/>
+              </w:rPr>
+              <w:t xml:space="preserve"> + </w:t>
+            </w:r>
+            <w:r>
+              <w:rPr>
+                <w:rFonts w:ascii="Consolas" w:hAnsi="Consolas" w:cs="Consolas" w:eastAsia="Consolas"/>
+                <w:b w:val="0"/>
+                <w:i w:val="0"/>
+                <w:sz w:val="16"/>
+              </w:rPr>
+              <w:t>1.6b_…</w:t>
+            </w:r>
+            <w:r>
+              <w:rPr>
+                <w:rFonts w:ascii="Arial" w:hAnsi="Arial" w:cs="Arial" w:eastAsia="Arial"/>
+                <w:b w:val="0"/>
+                <w:i w:val="0"/>
+                <w:sz w:val="17"/>
+              </w:rPr>
+              <w:t>.</w:t>
             </w:r>
           </w:p>
           <w:p>
@@ -4702,7 +4462,7 @@
                 <w:i w:val="0"/>
                 <w:sz w:val="17"/>
               </w:rPr>
-              <w:t>What to capture: http://127.0.0.1:7860 with one question answered by the local model and one by Gemini (switch the 'Which model answers?' button in between) – the '(model, x s)' line under each answer should show.</w:t>
+              <w:t>What to capture: the 'Week 1: Local LLM Chat (Ollama)' page (http://127.0.0.1:7860) after asking it something.</w:t>
             </w:r>
           </w:p>
           <w:p>
@@ -4820,7 +4580,7 @@
                 <w:i w:val="0"/>
                 <w:sz w:val="19"/>
               </w:rPr>
-              <w:t>Notebook – comparison table</w:t>
+              <w:t>Notebook – checkpoint answers + comparison table</w:t>
             </w:r>
           </w:p>
           <w:p>
@@ -4835,7 +4595,7 @@
                 <w:i w:val="0"/>
                 <w:sz w:val="17"/>
               </w:rPr>
-              <w:t>What to capture: the 'Deliverable – comparison table' output and the checkpoint question 2 answer under it.</w:t>
+              <w:t>What to capture: the 'Checkpoint Questions' cell at the end of the notebook with the comparison table.</w:t>
             </w:r>
           </w:p>
           <w:p>
@@ -4904,7 +4664,7 @@
           <w:i/>
           <w:sz w:val="17"/>
         </w:rPr>
-        <w:t>Screenshot 1.8 – Notebook – comparison table</w:t>
+        <w:t>Screenshot 1.8 – Notebook – checkpoint answers + comparison table</w:t>
       </w:r>
     </w:p>
     <w:p>
@@ -4933,7 +4693,25 @@
           <w:i w:val="0"/>
           <w:sz w:val="18"/>
         </w:rPr>
-        <w:t>Made from the numbers in my notebook run.</w:t>
+        <w:t xml:space="preserve">From my notebook run – latencies are what my </w:t>
+      </w:r>
+      <w:r>
+        <w:rPr>
+          <w:rFonts w:ascii="Consolas" w:hAnsi="Consolas" w:cs="Consolas" w:eastAsia="Consolas"/>
+          <w:b w:val="0"/>
+          <w:i w:val="0"/>
+          <w:sz w:val="17"/>
+        </w:rPr>
+        <w:t>time.time()</w:t>
+      </w:r>
+      <w:r>
+        <w:rPr>
+          <w:rFonts w:ascii="Arial" w:hAnsi="Arial" w:cs="Arial" w:eastAsia="Arial"/>
+          <w:b w:val="0"/>
+          <w:i w:val="0"/>
+          <w:sz w:val="18"/>
+        </w:rPr>
+        <w:t xml:space="preserve"> wrapper printed.</w:t>
       </w:r>
     </w:p>
     <w:tbl>
@@ -5050,7 +4828,25 @@
                 <w:i w:val="0"/>
                 <w:sz w:val="17"/>
               </w:rPr>
-              <w:t>install the Ollama app + download the model (~1.3 GB), no account or key</w:t>
+              <w:t xml:space="preserve">Install the Ollama app, download the model (~1.3 GB), </w:t>
+            </w:r>
+            <w:r>
+              <w:rPr>
+                <w:rFonts w:ascii="Consolas" w:hAnsi="Consolas" w:cs="Consolas" w:eastAsia="Consolas"/>
+                <w:b w:val="0"/>
+                <w:i w:val="0"/>
+                <w:sz w:val="16"/>
+              </w:rPr>
+              <w:t>pip install ollama</w:t>
+            </w:r>
+            <w:r>
+              <w:rPr>
+                <w:rFonts w:ascii="Arial" w:hAnsi="Arial" w:cs="Arial" w:eastAsia="Arial"/>
+                <w:b w:val="0"/>
+                <w:i w:val="0"/>
+                <w:sz w:val="17"/>
+              </w:rPr>
+              <w:t>. No account or key.</w:t>
             </w:r>
           </w:p>
         </w:tc>
@@ -5069,7 +4865,7 @@
                 <w:i w:val="0"/>
                 <w:sz w:val="17"/>
               </w:rPr>
-              <w:t xml:space="preserve">Google account + API key kept in </w:t>
+              <w:t xml:space="preserve">Google account + API key from AI Studio, </w:t>
             </w:r>
             <w:r>
               <w:rPr>
@@ -5078,25 +4874,16 @@
                 <w:i w:val="0"/>
                 <w:sz w:val="16"/>
               </w:rPr>
-              <w:t>.env</w:t>
-            </w:r>
-            <w:r>
-              <w:rPr>
-                <w:rFonts w:ascii="Arial" w:hAnsi="Arial" w:cs="Arial" w:eastAsia="Arial"/>
-                <w:b w:val="0"/>
-                <w:i w:val="0"/>
-                <w:sz w:val="17"/>
-              </w:rPr>
-              <w:t xml:space="preserve">, install </w:t>
-            </w:r>
-            <w:r>
-              <w:rPr>
-                <w:rFonts w:ascii="Consolas" w:hAnsi="Consolas" w:cs="Consolas" w:eastAsia="Consolas"/>
-                <w:b w:val="0"/>
-                <w:i w:val="0"/>
-                <w:sz w:val="16"/>
-              </w:rPr>
-              <w:t>google-genai</w:t>
+              <w:t>pip install google-genai</w:t>
+            </w:r>
+            <w:r>
+              <w:rPr>
+                <w:rFonts w:ascii="Arial" w:hAnsi="Arial" w:cs="Arial" w:eastAsia="Arial"/>
+                <w:b w:val="0"/>
+                <w:i w:val="0"/>
+                <w:sz w:val="17"/>
+              </w:rPr>
+              <w:t>. The key has to be kept secret.</w:t>
             </w:r>
           </w:p>
         </w:tc>
@@ -5120,7 +4907,7 @@
                 <w:i w:val="0"/>
                 <w:sz w:val="17"/>
               </w:rPr>
-              <w:t>Latency – 'What is an intelligent system?'</w:t>
+              <w:t>Latency – count M/F in 20 rows</w:t>
             </w:r>
           </w:p>
         </w:tc>
@@ -5135,12 +4922,11 @@
             <w:r>
               <w:rPr>
                 <w:rFonts w:ascii="Arial" w:hAnsi="Arial" w:cs="Arial" w:eastAsia="Arial"/>
-                <w:b w:val="0"/>
-                <w:i w:val="0"/>
-                <w:sz w:val="17"/>
-                <w:highlight w:val="yellow"/>
-              </w:rPr>
-              <w:t>x.x s</w:t>
+                <w:b/>
+                <w:i w:val="0"/>
+                <w:sz w:val="17"/>
+              </w:rPr>
+              <w:t>1.32 s</w:t>
             </w:r>
           </w:p>
         </w:tc>
@@ -5155,12 +4941,11 @@
             <w:r>
               <w:rPr>
                 <w:rFonts w:ascii="Arial" w:hAnsi="Arial" w:cs="Arial" w:eastAsia="Arial"/>
-                <w:b w:val="0"/>
-                <w:i w:val="0"/>
-                <w:sz w:val="17"/>
-                <w:highlight w:val="yellow"/>
-              </w:rPr>
-              <w:t>x.x s</w:t>
+                <w:b/>
+                <w:i w:val="0"/>
+                <w:sz w:val="17"/>
+              </w:rPr>
+              <w:t>3.18 s</w:t>
             </w:r>
           </w:p>
         </w:tc>
@@ -5184,7 +4969,7 @@
                 <w:i w:val="0"/>
                 <w:sz w:val="17"/>
               </w:rPr>
-              <w:t>Latency – sentiment, 20 reviews</w:t>
+              <w:t>Latency – apples, step by step</w:t>
             </w:r>
           </w:p>
         </w:tc>
@@ -5199,12 +4984,11 @@
             <w:r>
               <w:rPr>
                 <w:rFonts w:ascii="Arial" w:hAnsi="Arial" w:cs="Arial" w:eastAsia="Arial"/>
-                <w:b w:val="0"/>
-                <w:i w:val="0"/>
-                <w:sz w:val="17"/>
-                <w:highlight w:val="yellow"/>
-              </w:rPr>
-              <w:t>avg x.x s/review</w:t>
+                <w:b/>
+                <w:i w:val="0"/>
+                <w:sz w:val="17"/>
+              </w:rPr>
+              <w:t>1.07 s</w:t>
             </w:r>
           </w:p>
         </w:tc>
@@ -5219,12 +5003,11 @@
             <w:r>
               <w:rPr>
                 <w:rFonts w:ascii="Arial" w:hAnsi="Arial" w:cs="Arial" w:eastAsia="Arial"/>
-                <w:b w:val="0"/>
-                <w:i w:val="0"/>
-                <w:sz w:val="17"/>
-                <w:highlight w:val="yellow"/>
-              </w:rPr>
-              <w:t>avg x.x s/review</w:t>
+                <w:b/>
+                <w:i w:val="0"/>
+                <w:sz w:val="17"/>
+              </w:rPr>
+              <w:t>2.09 s</w:t>
             </w:r>
           </w:p>
         </w:tc>
@@ -5248,7 +5031,7 @@
                 <w:i w:val="0"/>
                 <w:sz w:val="17"/>
               </w:rPr>
-              <w:t>Cost</w:t>
+              <w:t>Latency – apples, direct</w:t>
             </w:r>
           </w:p>
         </w:tc>
@@ -5263,11 +5046,11 @@
             <w:r>
               <w:rPr>
                 <w:rFonts w:ascii="Arial" w:hAnsi="Arial" w:cs="Arial" w:eastAsia="Arial"/>
-                <w:b w:val="0"/>
-                <w:i w:val="0"/>
-                <w:sz w:val="17"/>
-              </w:rPr>
-              <w:t>$0 – runs on my laptop</w:t>
+                <w:b/>
+                <w:i w:val="0"/>
+                <w:sz w:val="17"/>
+              </w:rPr>
+              <w:t>0.91 s</w:t>
             </w:r>
           </w:p>
         </w:tc>
@@ -5282,21 +5065,11 @@
             <w:r>
               <w:rPr>
                 <w:rFonts w:ascii="Arial" w:hAnsi="Arial" w:cs="Arial" w:eastAsia="Arial"/>
-                <w:b w:val="0"/>
-                <w:i w:val="0"/>
-                <w:sz w:val="17"/>
-              </w:rPr>
-              <w:t xml:space="preserve">$0 on the free tier (limited requests per day) – </w:t>
-            </w:r>
-            <w:r>
-              <w:rPr>
-                <w:rFonts w:ascii="Arial" w:hAnsi="Arial" w:cs="Arial" w:eastAsia="Arial"/>
-                <w:b w:val="0"/>
-                <w:i w:val="0"/>
-                <w:sz w:val="17"/>
-                <w:highlight w:val="yellow"/>
-              </w:rPr>
-              <w:t>tokens used</w:t>
+                <w:b/>
+                <w:i w:val="0"/>
+                <w:sz w:val="17"/>
+              </w:rPr>
+              <w:t>1.67 s</w:t>
             </w:r>
           </w:p>
         </w:tc>
@@ -5320,7 +5093,7 @@
                 <w:i w:val="0"/>
                 <w:sz w:val="17"/>
               </w:rPr>
-              <w:t>Quality – sentiment (all 20 are negative)</w:t>
+              <w:t>Cost</w:t>
             </w:r>
           </w:p>
         </w:tc>
@@ -5338,9 +5111,8 @@
                 <w:b w:val="0"/>
                 <w:i w:val="0"/>
                 <w:sz w:val="17"/>
-                <w:highlight w:val="yellow"/>
-              </w:rPr>
-              <w:t>x/20 right</w:t>
+              </w:rPr>
+              <w:t>Free – runs on my own laptop (uses my CPU and memory).</w:t>
             </w:r>
           </w:p>
         </w:tc>
@@ -5358,9 +5130,8 @@
                 <w:b w:val="0"/>
                 <w:i w:val="0"/>
                 <w:sz w:val="17"/>
-                <w:highlight w:val="yellow"/>
-              </w:rPr>
-              <w:t>x/20 right</w:t>
+              </w:rPr>
+              <w:t>Free on the free tier (daily limits); past that you pay per token.</w:t>
             </w:r>
           </w:p>
         </w:tc>
@@ -5384,7 +5155,7 @@
                 <w:i w:val="0"/>
                 <w:sz w:val="17"/>
               </w:rPr>
-              <w:t>Quality – apples question (31)</w:t>
+              <w:t>Quality – counting</w:t>
             </w:r>
           </w:p>
         </w:tc>
@@ -5399,12 +5170,20 @@
             <w:r>
               <w:rPr>
                 <w:rFonts w:ascii="Arial" w:hAnsi="Arial" w:cs="Arial" w:eastAsia="Arial"/>
-                <w:b w:val="0"/>
-                <w:i w:val="0"/>
-                <w:sz w:val="17"/>
-                <w:highlight w:val="yellow"/>
-              </w:rPr>
-              <w:t>step by step x/3, direct x/3</w:t>
+                <w:b/>
+                <w:i w:val="0"/>
+                <w:sz w:val="17"/>
+              </w:rPr>
+              <w:t>Wrong</w:t>
+            </w:r>
+            <w:r>
+              <w:rPr>
+                <w:rFonts w:ascii="Arial" w:hAnsi="Arial" w:cs="Arial" w:eastAsia="Arial"/>
+                <w:b w:val="0"/>
+                <w:i w:val="0"/>
+                <w:sz w:val="17"/>
+              </w:rPr>
+              <w:t xml:space="preserve"> – 8 F + 9 M (only 17 of 20), then swapped them around in its last sentence.</w:t>
             </w:r>
           </w:p>
         </w:tc>
@@ -5419,12 +5198,20 @@
             <w:r>
               <w:rPr>
                 <w:rFonts w:ascii="Arial" w:hAnsi="Arial" w:cs="Arial" w:eastAsia="Arial"/>
-                <w:b w:val="0"/>
-                <w:i w:val="0"/>
-                <w:sz w:val="17"/>
-                <w:highlight w:val="yellow"/>
-              </w:rPr>
-              <w:t>step by step x/1, direct x/1</w:t>
+                <w:b/>
+                <w:i w:val="0"/>
+                <w:sz w:val="17"/>
+              </w:rPr>
+              <w:t>Right</w:t>
+            </w:r>
+            <w:r>
+              <w:rPr>
+                <w:rFonts w:ascii="Arial" w:hAnsi="Arial" w:cs="Arial" w:eastAsia="Arial"/>
+                <w:b w:val="0"/>
+                <w:i w:val="0"/>
+                <w:sz w:val="17"/>
+              </w:rPr>
+              <w:t xml:space="preserve"> – 11 F + 9 M = 20.</w:t>
             </w:r>
           </w:p>
         </w:tc>
@@ -5448,6 +5235,130 @@
                 <w:i w:val="0"/>
                 <w:sz w:val="17"/>
               </w:rPr>
+              <w:t>Quality – apples (31)</w:t>
+            </w:r>
+          </w:p>
+        </w:tc>
+        <w:tc>
+          <w:tcPr>
+            <w:tcW w:type="dxa" w:w="3009"/>
+          </w:tcPr>
+          <w:p>
+            <w:pPr>
+              <w:spacing w:before="40" w:after="40"/>
+            </w:pPr>
+            <w:r>
+              <w:rPr>
+                <w:rFonts w:ascii="Arial" w:hAnsi="Arial" w:cs="Arial" w:eastAsia="Arial"/>
+                <w:b w:val="0"/>
+                <w:i w:val="0"/>
+                <w:sz w:val="17"/>
+              </w:rPr>
+              <w:t>Right with both prompts, short plain working.</w:t>
+            </w:r>
+          </w:p>
+        </w:tc>
+        <w:tc>
+          <w:tcPr>
+            <w:tcW w:type="dxa" w:w="3009"/>
+          </w:tcPr>
+          <w:p>
+            <w:pPr>
+              <w:spacing w:before="40" w:after="40"/>
+            </w:pPr>
+            <w:r>
+              <w:rPr>
+                <w:rFonts w:ascii="Arial" w:hAnsi="Arial" w:cs="Arial" w:eastAsia="Arial"/>
+                <w:b w:val="0"/>
+                <w:i w:val="0"/>
+                <w:sz w:val="17"/>
+              </w:rPr>
+              <w:t>Right with both prompts, clearer step-by-step layout.</w:t>
+            </w:r>
+          </w:p>
+        </w:tc>
+      </w:tr>
+      <w:tr>
+        <w:trPr>
+          <w:cantSplit/>
+        </w:trPr>
+        <w:tc>
+          <w:tcPr>
+            <w:tcW w:type="dxa" w:w="3009"/>
+          </w:tcPr>
+          <w:p>
+            <w:pPr>
+              <w:spacing w:before="40" w:after="40"/>
+            </w:pPr>
+            <w:r>
+              <w:rPr>
+                <w:rFonts w:ascii="Arial" w:hAnsi="Arial" w:cs="Arial" w:eastAsia="Arial"/>
+                <w:b/>
+                <w:i w:val="0"/>
+                <w:sz w:val="17"/>
+              </w:rPr>
+              <w:t>Quality – 'What is an intelligent system?'</w:t>
+            </w:r>
+          </w:p>
+        </w:tc>
+        <w:tc>
+          <w:tcPr>
+            <w:tcW w:type="dxa" w:w="3009"/>
+          </w:tcPr>
+          <w:p>
+            <w:pPr>
+              <w:spacing w:before="40" w:after="40"/>
+            </w:pPr>
+            <w:r>
+              <w:rPr>
+                <w:rFonts w:ascii="Arial" w:hAnsi="Arial" w:cs="Arial" w:eastAsia="Arial"/>
+                <w:b w:val="0"/>
+                <w:i w:val="0"/>
+                <w:sz w:val="17"/>
+              </w:rPr>
+              <w:t>Long list, a bit generic – it even called 'self-awareness' a common feature.</w:t>
+            </w:r>
+          </w:p>
+        </w:tc>
+        <w:tc>
+          <w:tcPr>
+            <w:tcW w:type="dxa" w:w="3009"/>
+          </w:tcPr>
+          <w:p>
+            <w:pPr>
+              <w:spacing w:before="40" w:after="40"/>
+            </w:pPr>
+            <w:r>
+              <w:rPr>
+                <w:rFonts w:ascii="Arial" w:hAnsi="Arial" w:cs="Arial" w:eastAsia="Arial"/>
+                <w:b w:val="0"/>
+                <w:i w:val="0"/>
+                <w:sz w:val="17"/>
+              </w:rPr>
+              <w:t>Well organised (perceive → reason → learn → act, examples, technologies) and accurate.</w:t>
+            </w:r>
+          </w:p>
+        </w:tc>
+      </w:tr>
+      <w:tr>
+        <w:trPr>
+          <w:cantSplit/>
+        </w:trPr>
+        <w:tc>
+          <w:tcPr>
+            <w:tcW w:type="dxa" w:w="3009"/>
+          </w:tcPr>
+          <w:p>
+            <w:pPr>
+              <w:spacing w:before="40" w:after="40"/>
+            </w:pPr>
+            <w:r>
+              <w:rPr>
+                <w:rFonts w:ascii="Arial" w:hAnsi="Arial" w:cs="Arial" w:eastAsia="Arial"/>
+                <w:b/>
+                <w:i w:val="0"/>
+                <w:sz w:val="17"/>
+              </w:rPr>
               <w:t>Privacy / offline</w:t>
             </w:r>
           </w:p>
@@ -5467,7 +5378,7 @@
                 <w:i w:val="0"/>
                 <w:sz w:val="17"/>
               </w:rPr>
-              <w:t>nothing leaves my laptop, works offline</w:t>
+              <w:t>Nothing leaves my laptop, works offline.</w:t>
             </w:r>
           </w:p>
         </w:tc>
@@ -5486,7 +5397,7 @@
                 <w:i w:val="0"/>
                 <w:sz w:val="17"/>
               </w:rPr>
-              <w:t>reviews are sent to Google, needs internet</w:t>
+              <w:t>My prompt goes to Google; needs internet.</w:t>
             </w:r>
           </w:p>
         </w:tc>
@@ -5529,11 +5440,20 @@
       <w:r>
         <w:rPr>
           <w:rFonts w:ascii="Arial" w:hAnsi="Arial" w:cs="Arial" w:eastAsia="Arial"/>
+          <w:b/>
+          <w:i w:val="0"/>
+          <w:sz w:val="18"/>
+        </w:rPr>
+        <w:t>Local:</w:t>
+      </w:r>
+      <w:r>
+        <w:rPr>
+          <w:rFonts w:ascii="Arial" w:hAnsi="Arial" w:cs="Arial" w:eastAsia="Arial"/>
           <w:b w:val="0"/>
           <w:i w:val="0"/>
           <w:sz w:val="18"/>
         </w:rPr>
-        <w:t xml:space="preserve">Local: install one app and download the model once, then it just works – no account, no key, no limits and it even works offline. The catch is it uses my laptop's memory, it's only as fast as my laptop and I can only run small models. Cloud: nothing to download and a much bigger model, but I needed a Google account and an API key that I have to keep secret (in </w:t>
+        <w:t xml:space="preserve"> install the Ollama app, download the model once (llama3.2:1b is about 1.3 GB), </w:t>
       </w:r>
       <w:r>
         <w:rPr>
@@ -5542,7 +5462,7 @@
           <w:i w:val="0"/>
           <w:sz w:val="17"/>
         </w:rPr>
-        <w:t>.env</w:t>
+        <w:t>pip install ollama</w:t>
       </w:r>
       <w:r>
         <w:rPr>
@@ -5551,7 +5471,43 @@
           <w:i w:val="0"/>
           <w:sz w:val="18"/>
         </w:rPr>
-        <w:t>, never in the code or a screenshot), and I have to live with the free-tier limits.</w:t>
+        <w:t xml:space="preserve"> – then a few lines of code and it works. No account, no key, no limits and it even works offline, but it uses my laptop's memory and processor, so I can only run small models. </w:t>
+      </w:r>
+      <w:r>
+        <w:rPr>
+          <w:rFonts w:ascii="Arial" w:hAnsi="Arial" w:cs="Arial" w:eastAsia="Arial"/>
+          <w:b/>
+          <w:i w:val="0"/>
+          <w:sz w:val="18"/>
+        </w:rPr>
+        <w:t>Cloud:</w:t>
+      </w:r>
+      <w:r>
+        <w:rPr>
+          <w:rFonts w:ascii="Arial" w:hAnsi="Arial" w:cs="Arial" w:eastAsia="Arial"/>
+          <w:b w:val="0"/>
+          <w:i w:val="0"/>
+          <w:sz w:val="18"/>
+        </w:rPr>
+        <w:t xml:space="preserve"> nothing to download, but I needed a Google account, an API key from AI Studio and </w:t>
+      </w:r>
+      <w:r>
+        <w:rPr>
+          <w:rFonts w:ascii="Consolas" w:hAnsi="Consolas" w:cs="Consolas" w:eastAsia="Consolas"/>
+          <w:b w:val="0"/>
+          <w:i w:val="0"/>
+          <w:sz w:val="17"/>
+        </w:rPr>
+        <w:t>pip install google-genai</w:t>
+      </w:r>
+      <w:r>
+        <w:rPr>
+          <w:rFonts w:ascii="Arial" w:hAnsi="Arial" w:cs="Arial" w:eastAsia="Arial"/>
+          <w:b w:val="0"/>
+          <w:i w:val="0"/>
+          <w:sz w:val="18"/>
+        </w:rPr>
+        <w:t>. The key has to stay secret (not typed into the notebook), and the free tier has limits.</w:t>
       </w:r>
     </w:p>
     <w:p>
@@ -5579,9 +5535,40 @@
           <w:b w:val="0"/>
           <w:i w:val="0"/>
           <w:sz w:val="18"/>
-          <w:highlight w:val="yellow"/>
         </w:rPr>
-        <w:t>run the notebook – the answer is printed under the last cell (which reviews they disagreed on and why)</w:t>
+        <w:t xml:space="preserve">On the counting task. Ollama said 8 female and 9 male (only 17 – there are 20 rows) and then swapped them in its last sentence. Gemini said 11 female and 9 male = 20, which is right. The local model only has about 1 billion parameters, and LLMs don't really count – they read the list as tokens and guess the numbers, so a small model gets it wrong easily. Gemini is much bigger and thinks before it answers. (For counting, </w:t>
+      </w:r>
+      <w:r>
+        <w:rPr>
+          <w:rFonts w:ascii="Consolas" w:hAnsi="Consolas" w:cs="Consolas" w:eastAsia="Consolas"/>
+          <w:b w:val="0"/>
+          <w:i w:val="0"/>
+          <w:sz w:val="17"/>
+        </w:rPr>
+        <w:t>df['sex'].value_counts()</w:t>
+      </w:r>
+      <w:r>
+        <w:rPr>
+          <w:rFonts w:ascii="Arial" w:hAnsi="Arial" w:cs="Arial" w:eastAsia="Arial"/>
+          <w:b w:val="0"/>
+          <w:i w:val="0"/>
+          <w:sz w:val="18"/>
+        </w:rPr>
+        <w:t xml:space="preserve"> in pandas is the reliable way.)</w:t>
+      </w:r>
+    </w:p>
+    <w:p>
+      <w:pPr>
+        <w:spacing w:before="0" w:after="60"/>
+      </w:pPr>
+      <w:r>
+        <w:rPr>
+          <w:rFonts w:ascii="Arial" w:hAnsi="Arial" w:cs="Arial" w:eastAsia="Arial"/>
+          <w:b w:val="0"/>
+          <w:i w:val="0"/>
+          <w:sz w:val="18"/>
+        </w:rPr>
+        <w:t>On the apple question they agreed – both got 31 with and without 'think step by step'.</w:t>
       </w:r>
     </w:p>
     <w:sectPr>

</xml_diff>